<commit_message>
Add AI plans, sharing, and Clinicsoft rebrand
Introduces a major product update across backend and frontend: rebrands MiHistoria Salud to Clinicsoft, adds subscription simulation (FREE/SILVER/GOLD), AI consent and usage controls, chat assistant endpoints, scheduled AI analyses with notifications, and secure share packages/public share links with data export. It also expands clinical workflows with SYMPTOM events, symptom recurrence reporting, and event version history, while updating the mobile UI/navigation with new Plan, Chat, Share, Notifications, and More screens plus supporting domain/API changes.
</commit_message>
<xml_diff>
--- a/docs/Perfil_de_Proyecto.docx
+++ b/docs/Perfil_de_Proyecto.docx
@@ -226,7 +226,7 @@
           <w:b/>
           <w:sz w:val="24"/>
         </w:rPr>
-        <w:t xml:space="preserve"> NATIVO</w:t>
+        <w:t xml:space="preserve"> MULTIPLATAFORMA</w:t>
       </w:r>
       <w:r>
         <w:rPr>
@@ -234,7 +234,7 @@
           <w:b/>
           <w:sz w:val="24"/>
         </w:rPr>
-        <w:t xml:space="preserve"> DE HISTORIA CLÍNICA PERSONAL CON INTELIGENCIA ARTIFICIAL PARA EL APOYO A LA REVISIÓN DE INFORMACIÓN DE SALUD</w:t>
+        <w:t xml:space="preserve"> DE HISTORIA CLÍNICA PERSONAL PARA ANDROID Y WEB CON INTELIGENCIA ARTIFICIAL PARA EL APOYO A LA REVISIÓN DE INFORMACIÓN DE SALUD</w:t>
       </w:r>
       <w:commentRangeEnd w:id="1"/>
       <w:r>
@@ -436,9 +436,9 @@
     <w:p>
       <w:pPr>
         <w:tabs>
-          <w:tab w:pos="8901" w:val="right"/>
+          <w:tab w:val="right" w:pos="8901"/>
         </w:tabs>
-        <w:spacing w:before="0" w:after="0"/>
+        <w:spacing w:after="0"/>
       </w:pPr>
       <w:r>
         <w:rPr>
@@ -467,9 +467,9 @@
     <w:p>
       <w:pPr>
         <w:tabs>
-          <w:tab w:pos="8901" w:val="right"/>
+          <w:tab w:val="right" w:pos="8901"/>
         </w:tabs>
-        <w:spacing w:before="0" w:after="0"/>
+        <w:spacing w:after="0"/>
       </w:pPr>
       <w:r>
         <w:rPr>
@@ -498,9 +498,9 @@
     <w:p>
       <w:pPr>
         <w:tabs>
-          <w:tab w:pos="8901" w:val="right"/>
+          <w:tab w:val="right" w:pos="8901"/>
         </w:tabs>
-        <w:spacing w:before="0" w:after="0"/>
+        <w:spacing w:after="0"/>
         <w:ind w:left="312"/>
       </w:pPr>
       <w:r>
@@ -530,9 +530,9 @@
     <w:p>
       <w:pPr>
         <w:tabs>
-          <w:tab w:pos="8901" w:val="right"/>
+          <w:tab w:val="right" w:pos="8901"/>
         </w:tabs>
-        <w:spacing w:before="0" w:after="0"/>
+        <w:spacing w:after="0"/>
         <w:ind w:left="312"/>
       </w:pPr>
       <w:r>
@@ -562,9 +562,9 @@
     <w:p>
       <w:pPr>
         <w:tabs>
-          <w:tab w:pos="8901" w:val="right"/>
+          <w:tab w:val="right" w:pos="8901"/>
         </w:tabs>
-        <w:spacing w:before="0" w:after="0"/>
+        <w:spacing w:after="0"/>
       </w:pPr>
       <w:r>
         <w:rPr>
@@ -593,9 +593,9 @@
     <w:p>
       <w:pPr>
         <w:tabs>
-          <w:tab w:pos="8901" w:val="right"/>
+          <w:tab w:val="right" w:pos="8901"/>
         </w:tabs>
-        <w:spacing w:before="0" w:after="0"/>
+        <w:spacing w:after="0"/>
         <w:ind w:left="312"/>
       </w:pPr>
       <w:r>
@@ -625,9 +625,9 @@
     <w:p>
       <w:pPr>
         <w:tabs>
-          <w:tab w:pos="8901" w:val="right"/>
+          <w:tab w:val="right" w:pos="8901"/>
         </w:tabs>
-        <w:spacing w:before="0" w:after="0"/>
+        <w:spacing w:after="0"/>
         <w:ind w:left="312"/>
       </w:pPr>
       <w:r>
@@ -657,9 +657,9 @@
     <w:p>
       <w:pPr>
         <w:tabs>
-          <w:tab w:pos="8901" w:val="right"/>
+          <w:tab w:val="right" w:pos="8901"/>
         </w:tabs>
-        <w:spacing w:before="0" w:after="0"/>
+        <w:spacing w:after="0"/>
         <w:ind w:left="312"/>
       </w:pPr>
       <w:r>
@@ -689,9 +689,9 @@
     <w:p>
       <w:pPr>
         <w:tabs>
-          <w:tab w:pos="8901" w:val="right"/>
+          <w:tab w:val="right" w:pos="8901"/>
         </w:tabs>
-        <w:spacing w:before="0" w:after="0"/>
+        <w:spacing w:after="0"/>
       </w:pPr>
       <w:r>
         <w:rPr>
@@ -720,9 +720,9 @@
     <w:p>
       <w:pPr>
         <w:tabs>
-          <w:tab w:pos="8901" w:val="right"/>
+          <w:tab w:val="right" w:pos="8901"/>
         </w:tabs>
-        <w:spacing w:before="0" w:after="0"/>
+        <w:spacing w:after="0"/>
         <w:ind w:left="312"/>
       </w:pPr>
       <w:r>
@@ -752,9 +752,9 @@
     <w:p>
       <w:pPr>
         <w:tabs>
-          <w:tab w:pos="8901" w:val="right"/>
+          <w:tab w:val="right" w:pos="8901"/>
         </w:tabs>
-        <w:spacing w:before="0" w:after="0"/>
+        <w:spacing w:after="0"/>
         <w:ind w:left="312"/>
       </w:pPr>
       <w:r>
@@ -784,9 +784,9 @@
     <w:p>
       <w:pPr>
         <w:tabs>
-          <w:tab w:pos="8901" w:val="right"/>
+          <w:tab w:val="right" w:pos="8901"/>
         </w:tabs>
-        <w:spacing w:before="0" w:after="0"/>
+        <w:spacing w:after="0"/>
       </w:pPr>
       <w:r>
         <w:rPr>
@@ -815,9 +815,9 @@
     <w:p>
       <w:pPr>
         <w:tabs>
-          <w:tab w:pos="8901" w:val="right"/>
+          <w:tab w:val="right" w:pos="8901"/>
         </w:tabs>
-        <w:spacing w:before="0" w:after="0"/>
+        <w:spacing w:after="0"/>
         <w:ind w:left="312"/>
       </w:pPr>
       <w:r>
@@ -847,9 +847,9 @@
     <w:p>
       <w:pPr>
         <w:tabs>
-          <w:tab w:pos="8901" w:val="right"/>
+          <w:tab w:val="right" w:pos="8901"/>
         </w:tabs>
-        <w:spacing w:before="0" w:after="0"/>
+        <w:spacing w:after="0"/>
         <w:ind w:left="312"/>
       </w:pPr>
       <w:r>
@@ -879,9 +879,9 @@
     <w:p>
       <w:pPr>
         <w:tabs>
-          <w:tab w:pos="8901" w:val="right"/>
+          <w:tab w:val="right" w:pos="8901"/>
         </w:tabs>
-        <w:spacing w:before="0" w:after="0"/>
+        <w:spacing w:after="0"/>
       </w:pPr>
       <w:r>
         <w:rPr>
@@ -910,9 +910,9 @@
     <w:p>
       <w:pPr>
         <w:tabs>
-          <w:tab w:pos="8901" w:val="right"/>
+          <w:tab w:val="right" w:pos="8901"/>
         </w:tabs>
-        <w:spacing w:before="0" w:after="0"/>
+        <w:spacing w:after="0"/>
         <w:ind w:left="312"/>
       </w:pPr>
       <w:r>
@@ -942,9 +942,9 @@
     <w:p>
       <w:pPr>
         <w:tabs>
-          <w:tab w:pos="8901" w:val="right"/>
+          <w:tab w:val="right" w:pos="8901"/>
         </w:tabs>
-        <w:spacing w:before="0" w:after="0"/>
+        <w:spacing w:after="0"/>
         <w:ind w:left="624"/>
       </w:pPr>
       <w:r>
@@ -953,15 +953,7 @@
           <w:i/>
           <w:sz w:val="24"/>
         </w:rPr>
-        <w:t xml:space="preserve">6.1.1   </w:t>
-      </w:r>
-      <w:r>
-        <w:rPr>
-          <w:rFonts w:ascii="Times New Roman" w:hAnsi="Times New Roman"/>
-          <w:i/>
-          <w:sz w:val="24"/>
-        </w:rPr>
-        <w:t>HISTORIA CLÍNICA PERSONAL Y PERSONAL HEALTH RECORD</w:t>
+        <w:t>6.1.1   HISTORIA CLÍNICA PERSONAL Y PERSONAL HEALTH RECORD</w:t>
       </w:r>
       <w:r>
         <w:rPr>
@@ -976,9 +968,9 @@
     <w:p>
       <w:pPr>
         <w:tabs>
-          <w:tab w:pos="8901" w:val="right"/>
+          <w:tab w:val="right" w:pos="8901"/>
         </w:tabs>
-        <w:spacing w:before="0" w:after="0"/>
+        <w:spacing w:after="0"/>
         <w:ind w:left="624"/>
       </w:pPr>
       <w:r>
@@ -987,15 +979,7 @@
           <w:i/>
           <w:sz w:val="24"/>
         </w:rPr>
-        <w:t xml:space="preserve">6.1.2   </w:t>
-      </w:r>
-      <w:r>
-        <w:rPr>
-          <w:rFonts w:ascii="Times New Roman" w:hAnsi="Times New Roman"/>
-          <w:i/>
-          <w:sz w:val="24"/>
-        </w:rPr>
-        <w:t>HISTORIA CLÍNICA LONGITUDINAL</w:t>
+        <w:t>6.1.2   HISTORIA CLÍNICA LONGITUDINAL</w:t>
       </w:r>
       <w:r>
         <w:rPr>
@@ -1010,9 +994,9 @@
     <w:p>
       <w:pPr>
         <w:tabs>
-          <w:tab w:pos="8901" w:val="right"/>
+          <w:tab w:val="right" w:pos="8901"/>
         </w:tabs>
-        <w:spacing w:before="0" w:after="0"/>
+        <w:spacing w:after="0"/>
         <w:ind w:left="624"/>
       </w:pPr>
       <w:r>
@@ -1021,15 +1005,7 @@
           <w:i/>
           <w:sz w:val="24"/>
         </w:rPr>
-        <w:t xml:space="preserve">6.1.3   </w:t>
-      </w:r>
-      <w:r>
-        <w:rPr>
-          <w:rFonts w:ascii="Times New Roman" w:hAnsi="Times New Roman"/>
-          <w:i/>
-          <w:sz w:val="24"/>
-        </w:rPr>
-        <w:t>SALUD DIGITAL</w:t>
+        <w:t>6.1.3   SALUD DIGITAL</w:t>
       </w:r>
       <w:r>
         <w:rPr>
@@ -1044,9 +1020,9 @@
     <w:p>
       <w:pPr>
         <w:tabs>
-          <w:tab w:pos="8901" w:val="right"/>
+          <w:tab w:val="right" w:pos="8901"/>
         </w:tabs>
-        <w:spacing w:before="0" w:after="0"/>
+        <w:spacing w:after="0"/>
         <w:ind w:left="624"/>
       </w:pPr>
       <w:r>
@@ -1055,15 +1031,7 @@
           <w:i/>
           <w:sz w:val="24"/>
         </w:rPr>
-        <w:t xml:space="preserve">6.1.4   </w:t>
-      </w:r>
-      <w:r>
-        <w:rPr>
-          <w:rFonts w:ascii="Times New Roman" w:hAnsi="Times New Roman"/>
-          <w:i/>
-          <w:sz w:val="24"/>
-        </w:rPr>
-        <w:t>INTEROPERABILIDAD Y HL7 FHIR</w:t>
+        <w:t>6.1.4   INTEROPERABILIDAD Y HL7 FHIR</w:t>
       </w:r>
       <w:r>
         <w:rPr>
@@ -1078,9 +1046,9 @@
     <w:p>
       <w:pPr>
         <w:tabs>
-          <w:tab w:pos="8901" w:val="right"/>
+          <w:tab w:val="right" w:pos="8901"/>
         </w:tabs>
-        <w:spacing w:before="0" w:after="0"/>
+        <w:spacing w:after="0"/>
         <w:ind w:left="624"/>
       </w:pPr>
       <w:r>
@@ -1089,15 +1057,7 @@
           <w:i/>
           <w:sz w:val="24"/>
         </w:rPr>
-        <w:t xml:space="preserve">6.1.5   </w:t>
-      </w:r>
-      <w:r>
-        <w:rPr>
-          <w:rFonts w:ascii="Times New Roman" w:hAnsi="Times New Roman"/>
-          <w:i/>
-          <w:sz w:val="24"/>
-        </w:rPr>
-        <w:t>MEDICINA PREVENTIVA Y APOYO A LA TOMA DE DECISIONES</w:t>
+        <w:t>6.1.5   MEDICINA PREVENTIVA Y APOYO A LA TOMA DE DECISIONES</w:t>
       </w:r>
       <w:r>
         <w:rPr>
@@ -1112,9 +1072,9 @@
     <w:p>
       <w:pPr>
         <w:tabs>
-          <w:tab w:pos="8901" w:val="right"/>
+          <w:tab w:val="right" w:pos="8901"/>
         </w:tabs>
-        <w:spacing w:before="0" w:after="0"/>
+        <w:spacing w:after="0"/>
         <w:ind w:left="624"/>
       </w:pPr>
       <w:r>
@@ -1123,15 +1083,7 @@
           <w:i/>
           <w:sz w:val="24"/>
         </w:rPr>
-        <w:t xml:space="preserve">6.1.6   </w:t>
-      </w:r>
-      <w:r>
-        <w:rPr>
-          <w:rFonts w:ascii="Times New Roman" w:hAnsi="Times New Roman"/>
-          <w:i/>
-          <w:sz w:val="24"/>
-        </w:rPr>
-        <w:t>INTELIGENCIA ARTIFICIAL Y MODELOS DE LENGUAJE EN SALUD</w:t>
+        <w:t>6.1.6   INTELIGENCIA ARTIFICIAL Y MODELOS DE LENGUAJE EN SALUD</w:t>
       </w:r>
       <w:r>
         <w:rPr>
@@ -1146,9 +1098,9 @@
     <w:p>
       <w:pPr>
         <w:tabs>
-          <w:tab w:pos="8901" w:val="right"/>
+          <w:tab w:val="right" w:pos="8901"/>
         </w:tabs>
-        <w:spacing w:before="0" w:after="0"/>
+        <w:spacing w:after="0"/>
         <w:ind w:left="624"/>
       </w:pPr>
       <w:r>
@@ -1157,15 +1109,7 @@
           <w:i/>
           <w:sz w:val="24"/>
         </w:rPr>
-        <w:t xml:space="preserve">6.1.7   </w:t>
-      </w:r>
-      <w:r>
-        <w:rPr>
-          <w:rFonts w:ascii="Times New Roman" w:hAnsi="Times New Roman"/>
-          <w:i/>
-          <w:sz w:val="24"/>
-        </w:rPr>
-        <w:t>PRIVACIDAD, SEGURIDAD Y TRAZABILIDAD DE LOS DATOS</w:t>
+        <w:t>6.1.7   PRIVACIDAD, SEGURIDAD Y TRAZABILIDAD DE LOS DATOS</w:t>
       </w:r>
       <w:r>
         <w:rPr>
@@ -1180,9 +1124,9 @@
     <w:p>
       <w:pPr>
         <w:tabs>
-          <w:tab w:pos="8901" w:val="right"/>
+          <w:tab w:val="right" w:pos="8901"/>
         </w:tabs>
-        <w:spacing w:before="0" w:after="0"/>
+        <w:spacing w:after="0"/>
         <w:ind w:left="312"/>
       </w:pPr>
       <w:r>
@@ -1210,7 +1154,6 @@
       </w:r>
     </w:p>
     <w:p>
-      <w:pPr/>
       <w:r>
         <w:br w:type="page"/>
       </w:r>
@@ -1218,9 +1161,9 @@
     <w:p>
       <w:pPr>
         <w:tabs>
-          <w:tab w:pos="8901" w:val="right"/>
+          <w:tab w:val="right" w:pos="8901"/>
         </w:tabs>
-        <w:spacing w:before="0" w:after="0"/>
+        <w:spacing w:after="0"/>
         <w:ind w:left="624"/>
       </w:pPr>
       <w:r>
@@ -1229,15 +1172,8 @@
           <w:i/>
           <w:sz w:val="24"/>
         </w:rPr>
-        <w:t xml:space="preserve">6.2.1   </w:t>
-      </w:r>
-      <w:r>
-        <w:rPr>
-          <w:rFonts w:ascii="Times New Roman" w:hAnsi="Times New Roman"/>
-          <w:i/>
-          <w:sz w:val="24"/>
-        </w:rPr>
-        <w:t>TECNOLOGÍAS DE DESARROLLO FRONTEND</w:t>
+        <w:lastRenderedPageBreak/>
+        <w:t>6.2.1   TECNOLOGÍAS DE DESARROLLO FRONTEND</w:t>
       </w:r>
       <w:r>
         <w:rPr>
@@ -1252,32 +1188,29 @@
     <w:p>
       <w:pPr>
         <w:tabs>
-          <w:tab w:pos="8901" w:val="right"/>
+          <w:tab w:val="right" w:pos="8901"/>
         </w:tabs>
-        <w:spacing w:before="0" w:after="0"/>
+        <w:spacing w:after="0"/>
         <w:ind w:left="935"/>
+        <w:rPr>
+          <w:lang w:val="en-US"/>
+        </w:rPr>
       </w:pPr>
       <w:r>
         <w:rPr>
           <w:rFonts w:ascii="Times New Roman" w:hAnsi="Times New Roman"/>
           <w:i/>
           <w:sz w:val="24"/>
-        </w:rPr>
-        <w:t xml:space="preserve">6.2.1.1   </w:t>
+          <w:lang w:val="en-US"/>
+        </w:rPr>
+        <w:t>6.2.1.1   React Native y React Native Web</w:t>
       </w:r>
       <w:r>
         <w:rPr>
           <w:rFonts w:ascii="Times New Roman" w:hAnsi="Times New Roman"/>
           <w:i/>
           <w:sz w:val="24"/>
-        </w:rPr>
-        <w:t>React Native</w:t>
-      </w:r>
-      <w:r>
-        <w:rPr>
-          <w:rFonts w:ascii="Times New Roman" w:hAnsi="Times New Roman"/>
-          <w:i/>
-          <w:sz w:val="24"/>
+          <w:lang w:val="en-US"/>
         </w:rPr>
         <w:tab/>
         <w:t>13</w:t>
@@ -1286,9 +1219,9 @@
     <w:p>
       <w:pPr>
         <w:tabs>
-          <w:tab w:pos="8901" w:val="right"/>
+          <w:tab w:val="right" w:pos="8901"/>
         </w:tabs>
-        <w:spacing w:before="0" w:after="0"/>
+        <w:spacing w:after="0"/>
         <w:ind w:left="624"/>
       </w:pPr>
       <w:r>
@@ -1297,15 +1230,7 @@
           <w:i/>
           <w:sz w:val="24"/>
         </w:rPr>
-        <w:t xml:space="preserve">6.2.2   </w:t>
-      </w:r>
-      <w:r>
-        <w:rPr>
-          <w:rFonts w:ascii="Times New Roman" w:hAnsi="Times New Roman"/>
-          <w:i/>
-          <w:sz w:val="24"/>
-        </w:rPr>
-        <w:t>TECNOLOGÍAS DE BACKEND</w:t>
+        <w:t>6.2.2   TECNOLOGÍAS DE BACKEND</w:t>
       </w:r>
       <w:r>
         <w:rPr>
@@ -1320,9 +1245,9 @@
     <w:p>
       <w:pPr>
         <w:tabs>
-          <w:tab w:pos="8901" w:val="right"/>
+          <w:tab w:val="right" w:pos="8901"/>
         </w:tabs>
-        <w:spacing w:before="0" w:after="0"/>
+        <w:spacing w:after="0"/>
         <w:ind w:left="935"/>
       </w:pPr>
       <w:r>
@@ -1331,15 +1256,7 @@
           <w:i/>
           <w:sz w:val="24"/>
         </w:rPr>
-        <w:t xml:space="preserve">6.2.2.1   </w:t>
-      </w:r>
-      <w:r>
-        <w:rPr>
-          <w:rFonts w:ascii="Times New Roman" w:hAnsi="Times New Roman"/>
-          <w:i/>
-          <w:sz w:val="24"/>
-        </w:rPr>
-        <w:t>Node.js y Express.js</w:t>
+        <w:t>6.2.2.1   Node.js y Express.js</w:t>
       </w:r>
       <w:r>
         <w:rPr>
@@ -1354,9 +1271,9 @@
     <w:p>
       <w:pPr>
         <w:tabs>
-          <w:tab w:pos="8901" w:val="right"/>
+          <w:tab w:val="right" w:pos="8901"/>
         </w:tabs>
-        <w:spacing w:before="0" w:after="0"/>
+        <w:spacing w:after="0"/>
         <w:ind w:left="935"/>
       </w:pPr>
       <w:r>
@@ -1365,15 +1282,7 @@
           <w:i/>
           <w:sz w:val="24"/>
         </w:rPr>
-        <w:t xml:space="preserve">6.2.2.2   </w:t>
-      </w:r>
-      <w:r>
-        <w:rPr>
-          <w:rFonts w:ascii="Times New Roman" w:hAnsi="Times New Roman"/>
-          <w:i/>
-          <w:sz w:val="24"/>
-        </w:rPr>
-        <w:t>API de DeepSeek</w:t>
+        <w:t>6.2.2.2   API de DeepSeek</w:t>
       </w:r>
       <w:r>
         <w:rPr>
@@ -1388,9 +1297,9 @@
     <w:p>
       <w:pPr>
         <w:tabs>
-          <w:tab w:pos="8901" w:val="right"/>
+          <w:tab w:val="right" w:pos="8901"/>
         </w:tabs>
-        <w:spacing w:before="0" w:after="0"/>
+        <w:spacing w:after="0"/>
         <w:ind w:left="624"/>
       </w:pPr>
       <w:r>
@@ -1399,15 +1308,7 @@
           <w:i/>
           <w:sz w:val="24"/>
         </w:rPr>
-        <w:t xml:space="preserve">6.2.3   </w:t>
-      </w:r>
-      <w:r>
-        <w:rPr>
-          <w:rFonts w:ascii="Times New Roman" w:hAnsi="Times New Roman"/>
-          <w:i/>
-          <w:sz w:val="24"/>
-        </w:rPr>
-        <w:t>GESTIÓN DE BASE DE DATOS</w:t>
+        <w:t>6.2.3   GESTIÓN DE BASE DE DATOS</w:t>
       </w:r>
       <w:r>
         <w:rPr>
@@ -1422,9 +1323,9 @@
     <w:p>
       <w:pPr>
         <w:tabs>
-          <w:tab w:pos="8901" w:val="right"/>
+          <w:tab w:val="right" w:pos="8901"/>
         </w:tabs>
-        <w:spacing w:before="0" w:after="0"/>
+        <w:spacing w:after="0"/>
         <w:ind w:left="935"/>
       </w:pPr>
       <w:r>
@@ -1433,15 +1334,7 @@
           <w:i/>
           <w:sz w:val="24"/>
         </w:rPr>
-        <w:t xml:space="preserve">6.2.3.1   </w:t>
-      </w:r>
-      <w:r>
-        <w:rPr>
-          <w:rFonts w:ascii="Times New Roman" w:hAnsi="Times New Roman"/>
-          <w:i/>
-          <w:sz w:val="24"/>
-        </w:rPr>
-        <w:t>MySQL</w:t>
+        <w:t>6.2.3.1   MySQL</w:t>
       </w:r>
       <w:r>
         <w:rPr>
@@ -1456,9 +1349,9 @@
     <w:p>
       <w:pPr>
         <w:tabs>
-          <w:tab w:pos="8901" w:val="right"/>
+          <w:tab w:val="right" w:pos="8901"/>
         </w:tabs>
-        <w:spacing w:before="0" w:after="0"/>
+        <w:spacing w:after="0"/>
         <w:ind w:left="624"/>
       </w:pPr>
       <w:r>
@@ -1467,15 +1360,7 @@
           <w:i/>
           <w:sz w:val="24"/>
         </w:rPr>
-        <w:t xml:space="preserve">6.2.4   </w:t>
-      </w:r>
-      <w:r>
-        <w:rPr>
-          <w:rFonts w:ascii="Times New Roman" w:hAnsi="Times New Roman"/>
-          <w:i/>
-          <w:sz w:val="24"/>
-        </w:rPr>
-        <w:t>CONTROL DE VERSIONES Y COLABORACIÓN</w:t>
+        <w:t>6.2.4   CONTROL DE VERSIONES Y COLABORACIÓN</w:t>
       </w:r>
       <w:r>
         <w:rPr>
@@ -1490,9 +1375,9 @@
     <w:p>
       <w:pPr>
         <w:tabs>
-          <w:tab w:pos="8901" w:val="right"/>
+          <w:tab w:val="right" w:pos="8901"/>
         </w:tabs>
-        <w:spacing w:before="0" w:after="0"/>
+        <w:spacing w:after="0"/>
         <w:ind w:left="935"/>
       </w:pPr>
       <w:r>
@@ -1501,15 +1386,7 @@
           <w:i/>
           <w:sz w:val="24"/>
         </w:rPr>
-        <w:t xml:space="preserve">6.2.4.1   </w:t>
-      </w:r>
-      <w:r>
-        <w:rPr>
-          <w:rFonts w:ascii="Times New Roman" w:hAnsi="Times New Roman"/>
-          <w:i/>
-          <w:sz w:val="24"/>
-        </w:rPr>
-        <w:t>Git y GitHub</w:t>
+        <w:t>6.2.4.1   Git y GitHub</w:t>
       </w:r>
       <w:r>
         <w:rPr>
@@ -1524,9 +1401,9 @@
     <w:p>
       <w:pPr>
         <w:tabs>
-          <w:tab w:pos="8901" w:val="right"/>
+          <w:tab w:val="right" w:pos="8901"/>
         </w:tabs>
-        <w:spacing w:before="0" w:after="0"/>
+        <w:spacing w:after="0"/>
         <w:ind w:left="624"/>
       </w:pPr>
       <w:r>
@@ -1535,15 +1412,7 @@
           <w:i/>
           <w:sz w:val="24"/>
         </w:rPr>
-        <w:t xml:space="preserve">6.2.5   </w:t>
-      </w:r>
-      <w:r>
-        <w:rPr>
-          <w:rFonts w:ascii="Times New Roman" w:hAnsi="Times New Roman"/>
-          <w:i/>
-          <w:sz w:val="24"/>
-        </w:rPr>
-        <w:t>DESPLIEGUE E INFRAESTRUCTURA</w:t>
+        <w:t>6.2.5   DESPLIEGUE E INFRAESTRUCTURA</w:t>
       </w:r>
       <w:r>
         <w:rPr>
@@ -1558,9 +1427,9 @@
     <w:p>
       <w:pPr>
         <w:tabs>
-          <w:tab w:pos="8901" w:val="right"/>
+          <w:tab w:val="right" w:pos="8901"/>
         </w:tabs>
-        <w:spacing w:before="0" w:after="0"/>
+        <w:spacing w:after="0"/>
         <w:ind w:left="935"/>
       </w:pPr>
       <w:r>
@@ -1569,15 +1438,7 @@
           <w:i/>
           <w:sz w:val="24"/>
         </w:rPr>
-        <w:t xml:space="preserve">6.2.5.1   </w:t>
-      </w:r>
-      <w:r>
-        <w:rPr>
-          <w:rFonts w:ascii="Times New Roman" w:hAnsi="Times New Roman"/>
-          <w:i/>
-          <w:sz w:val="24"/>
-        </w:rPr>
-        <w:t>Almacenamiento privado de archivos en la nube</w:t>
+        <w:t>6.2.5.1   Almacenamiento privado de archivos en la nube</w:t>
       </w:r>
       <w:r>
         <w:rPr>
@@ -1592,9 +1453,9 @@
     <w:p>
       <w:pPr>
         <w:tabs>
-          <w:tab w:pos="8901" w:val="right"/>
+          <w:tab w:val="right" w:pos="8901"/>
         </w:tabs>
-        <w:spacing w:before="0" w:after="0"/>
+        <w:spacing w:after="0"/>
         <w:ind w:left="312"/>
       </w:pPr>
       <w:r>
@@ -1624,9 +1485,9 @@
     <w:p>
       <w:pPr>
         <w:tabs>
-          <w:tab w:pos="8901" w:val="right"/>
+          <w:tab w:val="right" w:pos="8901"/>
         </w:tabs>
-        <w:spacing w:before="0" w:after="0"/>
+        <w:spacing w:after="0"/>
         <w:ind w:left="624"/>
       </w:pPr>
       <w:r>
@@ -1635,15 +1496,7 @@
           <w:i/>
           <w:sz w:val="24"/>
         </w:rPr>
-        <w:t xml:space="preserve">6.3.1   </w:t>
-      </w:r>
-      <w:r>
-        <w:rPr>
-          <w:rFonts w:ascii="Times New Roman" w:hAnsi="Times New Roman"/>
-          <w:i/>
-          <w:sz w:val="24"/>
-        </w:rPr>
-        <w:t>ADAPTACIÓN DE LAS METODOLOGÍAS ÁGILES</w:t>
+        <w:t>6.3.1   ADAPTACIÓN DE LAS METODOLOGÍAS ÁGILES</w:t>
       </w:r>
       <w:r>
         <w:rPr>
@@ -1658,9 +1511,9 @@
     <w:p>
       <w:pPr>
         <w:tabs>
-          <w:tab w:pos="8901" w:val="right"/>
+          <w:tab w:val="right" w:pos="8901"/>
         </w:tabs>
-        <w:spacing w:before="0" w:after="0"/>
+        <w:spacing w:after="0"/>
         <w:ind w:left="624"/>
       </w:pPr>
       <w:r>
@@ -1669,15 +1522,7 @@
           <w:i/>
           <w:sz w:val="24"/>
         </w:rPr>
-        <w:t xml:space="preserve">6.3.2   </w:t>
-      </w:r>
-      <w:r>
-        <w:rPr>
-          <w:rFonts w:ascii="Times New Roman" w:hAnsi="Times New Roman"/>
-          <w:i/>
-          <w:sz w:val="24"/>
-        </w:rPr>
-        <w:t>KANBAN</w:t>
+        <w:t>6.3.2   KANBAN</w:t>
       </w:r>
       <w:r>
         <w:rPr>
@@ -1692,9 +1537,9 @@
     <w:p>
       <w:pPr>
         <w:tabs>
-          <w:tab w:pos="8901" w:val="right"/>
+          <w:tab w:val="right" w:pos="8901"/>
         </w:tabs>
-        <w:spacing w:before="0" w:after="0"/>
+        <w:spacing w:after="0"/>
         <w:ind w:left="312"/>
       </w:pPr>
       <w:r>
@@ -1724,9 +1569,9 @@
     <w:p>
       <w:pPr>
         <w:tabs>
-          <w:tab w:pos="8901" w:val="right"/>
+          <w:tab w:val="right" w:pos="8901"/>
         </w:tabs>
-        <w:spacing w:before="0" w:after="0"/>
+        <w:spacing w:after="0"/>
       </w:pPr>
       <w:r>
         <w:rPr>
@@ -1755,9 +1600,9 @@
     <w:p>
       <w:pPr>
         <w:tabs>
-          <w:tab w:pos="8901" w:val="right"/>
+          <w:tab w:val="right" w:pos="8901"/>
         </w:tabs>
-        <w:spacing w:before="0" w:after="0"/>
+        <w:spacing w:after="0"/>
         <w:ind w:left="312"/>
       </w:pPr>
       <w:r>
@@ -1787,9 +1632,9 @@
     <w:p>
       <w:pPr>
         <w:tabs>
-          <w:tab w:pos="8901" w:val="right"/>
+          <w:tab w:val="right" w:pos="8901"/>
         </w:tabs>
-        <w:spacing w:before="0" w:after="0"/>
+        <w:spacing w:after="0"/>
         <w:ind w:left="312"/>
       </w:pPr>
       <w:r>
@@ -1819,9 +1664,9 @@
     <w:p>
       <w:pPr>
         <w:tabs>
-          <w:tab w:pos="8901" w:val="right"/>
+          <w:tab w:val="right" w:pos="8901"/>
         </w:tabs>
-        <w:spacing w:before="0" w:after="0"/>
+        <w:spacing w:after="0"/>
         <w:ind w:left="312"/>
       </w:pPr>
       <w:r>
@@ -1851,9 +1696,9 @@
     <w:p>
       <w:pPr>
         <w:tabs>
-          <w:tab w:pos="8901" w:val="right"/>
+          <w:tab w:val="right" w:pos="8901"/>
         </w:tabs>
-        <w:spacing w:before="0" w:after="0"/>
+        <w:spacing w:after="0"/>
         <w:ind w:left="312"/>
       </w:pPr>
       <w:r>
@@ -1883,9 +1728,9 @@
     <w:p>
       <w:pPr>
         <w:tabs>
-          <w:tab w:pos="8901" w:val="right"/>
+          <w:tab w:val="right" w:pos="8901"/>
         </w:tabs>
-        <w:spacing w:before="0" w:after="0"/>
+        <w:spacing w:after="0"/>
         <w:ind w:left="312"/>
       </w:pPr>
       <w:r>
@@ -1915,9 +1760,9 @@
     <w:p>
       <w:pPr>
         <w:tabs>
-          <w:tab w:pos="8901" w:val="right"/>
+          <w:tab w:val="right" w:pos="8901"/>
         </w:tabs>
-        <w:spacing w:before="0" w:after="0"/>
+        <w:spacing w:after="0"/>
         <w:ind w:left="312"/>
       </w:pPr>
       <w:r>
@@ -1947,9 +1792,9 @@
     <w:p>
       <w:pPr>
         <w:tabs>
-          <w:tab w:pos="8901" w:val="right"/>
+          <w:tab w:val="right" w:pos="8901"/>
         </w:tabs>
-        <w:spacing w:before="0" w:after="0"/>
+        <w:spacing w:after="0"/>
       </w:pPr>
       <w:r>
         <w:rPr>
@@ -1978,9 +1823,9 @@
     <w:p>
       <w:pPr>
         <w:tabs>
-          <w:tab w:pos="8901" w:val="right"/>
+          <w:tab w:val="right" w:pos="8901"/>
         </w:tabs>
-        <w:spacing w:before="0" w:after="0"/>
+        <w:spacing w:after="0"/>
       </w:pPr>
       <w:r>
         <w:rPr>
@@ -2009,9 +1854,9 @@
     <w:p>
       <w:pPr>
         <w:tabs>
-          <w:tab w:pos="8901" w:val="right"/>
+          <w:tab w:val="right" w:pos="8901"/>
         </w:tabs>
-        <w:spacing w:before="0" w:after="0"/>
+        <w:spacing w:after="0"/>
         <w:sectPr>
           <w:headerReference w:type="default" r:id="rId14"/>
           <w:footerReference w:type="default" r:id="rId15"/>
@@ -2150,20 +1995,16 @@
         <w:rPr>
           <w:color w:val="000000"/>
         </w:rPr>
-        <w:t>Ante esta situación, el proyecto plantea el desarrollo de una aplicación móvil de historia clínica personal que permita registrar cronológicamente consultas, diagnósticos, tratamientos, medicamentos, alergias, vacunas, cirugías, antecedentes familiares, resultados de laboratorio y documentos clínicos. La información se organizará mediante una línea de tiempo, filtros de consulta y vistas resumidas, de modo que el usuario pueda localizar antecedentes y preparar información relevante antes de una atención médica. Para perfiles dependientes, como menores de edad, personas de la tercera edad y otros casos que requieran apoyo, se contemplará la administración del registro por parte de un representante autorizado.</w:t>
-      </w:r>
-      <w:commentRangeStart w:id="4"/>
-      <w:commentRangeStart w:id="5"/>
-      <w:commentRangeEnd w:id="4"/>
-      <w:commentRangeEnd w:id="5"/>
-    </w:p>
-    <w:p>
-      <w:r>
-        <w:rPr>
-          <w:rFonts w:ascii="Times New Roman" w:hAnsi="Times New Roman"/>
-          <w:sz w:val="24"/>
-        </w:rPr>
-        <w:t xml:space="preserve">Como componente complementario, la plataforma incorporará herramientas de inteligencia artificial que operarán únicamente sobre información seleccionada por el usuario. Su función se limitará a generar un resumen no diagnóstico, señalar posibles datos incompletos o contradictorios dentro del registro y proponer preguntas informativas para conversar con un </w:t>
+        <w:t>Ante esta situación, el proyecto plantea el desarrollo de una aplicación multiplataforma para Android y web de historia clínica personal que permita registrar cronológicamente consultas, diagnósticos, tratamientos, medicamentos, alergias, vacunas, cirugías, antecedentes familiares, resultados de laboratorio y documentos clínicos. La información se organizará mediante una línea de tiempo, filtros de consulta y vistas resumidas, de modo que el usuario pueda localizar antecedentes y preparar información relevante antes de una atención médica. Para perfiles dependientes, como menores de edad, personas de la tercera edad y otros casos que requieran apoyo, se contemplará la administración del registro por parte de un representante autorizado.</w:t>
+      </w:r>
+    </w:p>
+    <w:p>
+      <w:r>
+        <w:rPr>
+          <w:rFonts w:ascii="Times New Roman" w:hAnsi="Times New Roman"/>
+          <w:sz w:val="24"/>
+        </w:rPr>
+        <w:t xml:space="preserve">Como componente complementario, la plataforma incorporará herramientas de inteligencia artificial que operarán únicamente sobre información seleccionada por el usuario. Su función se limitará a generar un resumen no diagnóstico, señalar posibles datos incompletos o </w:t>
       </w:r>
       <w:r>
         <w:rPr>
@@ -2171,22 +2012,22 @@
           <w:sz w:val="24"/>
         </w:rPr>
         <w:lastRenderedPageBreak/>
-        <w:t>profesional de salud. Estas salidas no establecerán factores de riesgo, no recomendarán estudios ni sustituirán la evaluación clínica.</w:t>
-      </w:r>
-    </w:p>
-    <w:p>
-      <w:pPr>
-        <w:rPr>
-          <w:color w:val="000000"/>
-        </w:rPr>
-      </w:pPr>
-      <w:r>
-        <w:rPr>
-          <w:rFonts w:ascii="Times New Roman" w:hAnsi="Times New Roman"/>
-          <w:color w:val="000000"/>
-          <w:sz w:val="24"/>
-        </w:rPr>
-        <w:t>La inteligencia artificial no emitirá diagnósticos ni sustituirá el criterio médico, y sus resultados incluirán advertencias explícitas sobre incertidumbre y alcance (Ethics and governance of artificial intelligence for health: WHO guidance, 2021). La solución se implementará con React Native para la aplicación móvil, Node.js con Express.js para el backend, MySQL como base de datos relacional, almacenamiento privado de archivos en la nube y consumo controlado de la API de DeepSeek.</w:t>
+        <w:t>contradictorios dentro del registro y proponer preguntas informativas para conversar con un profesional de salud. Estas salidas no establecerán factores de riesgo, no recomendarán estudios ni sustituirán la evaluación clínica.</w:t>
+      </w:r>
+    </w:p>
+    <w:p>
+      <w:pPr>
+        <w:rPr>
+          <w:color w:val="000000"/>
+        </w:rPr>
+      </w:pPr>
+      <w:r>
+        <w:rPr>
+          <w:rFonts w:ascii="Times New Roman" w:hAnsi="Times New Roman"/>
+          <w:color w:val="000000"/>
+          <w:sz w:val="24"/>
+        </w:rPr>
+        <w:t>La inteligencia artificial no emitirá diagnósticos ni sustituirá el criterio médico, y sus resultados incluirán advertencias explícitas sobre incertidumbre y alcance (Ethics and governance of artificial intelligence for health: WHO guidance, 2021). La solución se implementará con React Native y React Native Web para ofrecer una interfaz multiplataforma en Android y navegadores web, Node.js con Express.js para el backend, MySQL como base de datos relacional, almacenamiento privado de archivos en la nube y consumo controlado de la API de DeepSeek.</w:t>
       </w:r>
     </w:p>
     <w:p>
@@ -2196,7 +2037,7 @@
           <w:color w:val="auto"/>
         </w:rPr>
       </w:pPr>
-      <w:bookmarkStart w:id="6" w:name="h_2_antecedentes"/>
+      <w:bookmarkStart w:id="4" w:name="h_2_antecedentes"/>
       <w:r>
         <w:rPr>
           <w:rFonts w:ascii="Arial" w:eastAsia="Arial" w:hAnsi="Arial" w:cs="Arial"/>
@@ -2204,7 +2045,7 @@
         </w:rPr>
         <w:t>2 ANTECEDENTES</w:t>
       </w:r>
-      <w:bookmarkEnd w:id="6"/>
+      <w:bookmarkEnd w:id="4"/>
     </w:p>
     <w:p>
       <w:r>
@@ -2344,6 +2185,7 @@
         <w:rPr>
           <w:noProof/>
         </w:rPr>
+        <w:lastRenderedPageBreak/>
         <w:t>(Tang, Ash, Bates, Overhage, &amp; Sands, 2006)</w:t>
       </w:r>
       <w:r>
@@ -2354,15 +2196,7 @@
           <w:rFonts w:ascii="Times New Roman" w:hAnsi="Times New Roman"/>
           <w:sz w:val="24"/>
         </w:rPr>
-        <w:t xml:space="preserve">. No obstante, debido a la sensibilidad de los datos médicos, una solución de este tipo debe incorporar mecanismos de privacidad, control de </w:t>
-      </w:r>
-      <w:r>
-        <w:rPr>
-          <w:rFonts w:ascii="Times New Roman" w:hAnsi="Times New Roman"/>
-          <w:sz w:val="24"/>
-        </w:rPr>
-        <w:lastRenderedPageBreak/>
-        <w:t xml:space="preserve">acceso, consentimiento, trazabilidad y protección de la información durante su almacenamiento y utilización </w:t>
+        <w:t xml:space="preserve">. No obstante, debido a la sensibilidad de los datos médicos, una solución de este tipo debe incorporar mecanismos de privacidad, control de acceso, consentimiento, trazabilidad y protección de la información durante su almacenamiento y utilización </w:t>
       </w:r>
       <w:r>
         <w:fldChar w:fldCharType="begin"/>
@@ -2402,7 +2236,7 @@
           <w:rFonts w:ascii="Times New Roman" w:hAnsi="Times New Roman"/>
           <w:sz w:val="24"/>
         </w:rPr>
-        <w:t>De forma paralela, el desarrollo reciente de herramientas de inteligencia artificial crea la posibilidad de resumir información longitudinal y apoyar la revisión de registros. Su aplicación en salud requiere límites claros, supervisión humana, protección de datos y advertencias que eviten presentar las respuestas del sistema como diagnósticos (Ethics and governance of artificial intelligence for health: WHO guidance, 2021). A partir de estos antecedentes, el presente proyecto propone una aplicación móvil de historia clínica personal que centralice información de salud a lo largo del tiempo e incorpore inteligencia artificial únicamente para resumir información seleccionada y señalar posibles datos incompletos o contradictorios que el usuario pueda revisar con un profesional de salud.</w:t>
+        <w:t>De forma paralela, el desarrollo reciente de herramientas de inteligencia artificial crea la posibilidad de resumir información longitudinal y apoyar la revisión de registros. Su aplicación en salud requiere límites claros, supervisión humana, protección de datos y advertencias que eviten presentar las respuestas del sistema como diagnósticos (Ethics and governance of artificial intelligence for health: WHO guidance, 2021). A partir de estos antecedentes, el presente proyecto propone una aplicación multiplataforma para Android y web de historia clínica personal que centralice información de salud a lo largo del tiempo e incorpore inteligencia artificial únicamente para resumir información seleccionada y señalar posibles datos incompletos o contradictorios que el usuario pueda revisar con un profesional de salud.</w:t>
       </w:r>
     </w:p>
     <w:p>
@@ -2496,8 +2330,8 @@
         </w:rPr>
         <w:t>p</w:t>
       </w:r>
-      <w:commentRangeStart w:id="8"/>
-      <w:commentRangeStart w:id="9"/>
+      <w:commentRangeStart w:id="5"/>
+      <w:commentRangeStart w:id="6"/>
       <w:r>
         <w:rPr>
           <w:rFonts w:ascii="Times New Roman" w:hAnsi="Times New Roman"/>
@@ -2506,7 +2340,7 @@
         </w:rPr>
         <w:t>r</w:t>
       </w:r>
-      <w:commentRangeEnd w:id="8"/>
+      <w:commentRangeEnd w:id="5"/>
       <w:r>
         <w:rPr>
           <w:rStyle w:val="CommentReference"/>
@@ -2515,9 +2349,9 @@
           <w:sz w:val="24"/>
           <w:szCs w:val="22"/>
         </w:rPr>
-        <w:commentReference w:id="8"/>
-      </w:r>
-      <w:commentRangeEnd w:id="9"/>
+        <w:commentReference w:id="5"/>
+      </w:r>
+      <w:commentRangeEnd w:id="6"/>
       <w:r>
         <w:rPr>
           <w:rStyle w:val="CommentReference"/>
@@ -2526,7 +2360,7 @@
           <w:sz w:val="24"/>
           <w:szCs w:val="22"/>
         </w:rPr>
-        <w:commentReference w:id="9"/>
+        <w:commentReference w:id="6"/>
       </w:r>
       <w:r>
         <w:rPr>
@@ -2584,6 +2418,7 @@
           <w:color w:val="000000"/>
           <w:sz w:val="24"/>
         </w:rPr>
+        <w:lastRenderedPageBreak/>
         <w:t xml:space="preserve">Como consecuencia, localizar información </w:t>
       </w:r>
       <w:r>
@@ -2609,16 +2444,7 @@
           <w:color w:val="000000"/>
           <w:sz w:val="24"/>
         </w:rPr>
-        <w:t xml:space="preserve">antigua puede requerir tiempo, pueden omitirse antecedentes relevantes y se reduce la capacidad de observar tendencias a lo largo del </w:t>
-      </w:r>
-      <w:r>
-        <w:rPr>
-          <w:rFonts w:ascii="Times New Roman" w:hAnsi="Times New Roman"/>
-          <w:color w:val="000000"/>
-          <w:sz w:val="24"/>
-        </w:rPr>
-        <w:lastRenderedPageBreak/>
-        <w:t>tiempo. Además, aun cuando el usuario conserve numerosos documentos, estos pueden permanecer como archivos aislados que no facilitan una lectura integral del historial</w:t>
+        <w:t>antigua puede requerir tiempo, pueden omitirse antecedentes relevantes y se reduce la capacidad de observar tendencias a lo largo del tiempo. Además, aun cuando el usuario conserve numerosos documentos, estos pueden permanecer como archivos aislados que no facilitan una lectura integral del historial</w:t>
       </w:r>
       <w:r>
         <w:rPr>
@@ -2653,24 +2479,16 @@
           <w:color w:val="000000"/>
           <w:sz w:val="24"/>
         </w:rPr>
-        <w:t>El problema se delimita al desarrollo y validación académica de un prototipo móvil para usuarios de Cochabamba que administran su propia información médica personal. El sistema no reemplazará la historia clínica oficial de una institución clínica u hospitalaria ni realizará interoperabilidad automática con hospitales o laboratorios durante la primera versión. El análisis mediante inteligencia artificial se tratará como apoyo informativo no diagnóstico y se probará preferentemente con datos ficticios, sintéticos o seudonimizados, respetando principios de minimización y protección de información sensible (Ethical considerations and data protection principles for digital personal health records, 2022).</w:t>
-      </w:r>
-    </w:p>
-    <w:p>
-      <w:r>
-        <w:rPr>
-          <w:rFonts w:ascii="Times New Roman" w:hAnsi="Times New Roman"/>
-          <w:sz w:val="24"/>
-        </w:rPr>
-        <w:t xml:space="preserve">¿Cómo centralizar, organizar y consultar la información de salud personal de manera longitudinal, segura y accesible, incorporando herramientas de inteligencia artificial para apoyar </w:t>
-      </w:r>
-      <w:r>
-        <w:rPr>
-          <w:rFonts w:ascii="Times New Roman" w:hAnsi="Times New Roman"/>
-          <w:sz w:val="24"/>
-        </w:rPr>
-        <w:lastRenderedPageBreak/>
-        <w:t>la revisión de información seleccionada por el usuario sin sustituir la evaluación de un profesional de salud?</w:t>
+        <w:t>El problema se delimita al desarrollo y validación académica de un prototipo multiplataforma para Android y web dirigido a usuarios de Cochabamba que administran su propia información médica personal. El sistema no reemplazará la historia clínica oficial de una institución clínica u hospitalaria ni realizará interoperabilidad automática con hospitales o laboratorios durante la primera versión. El análisis mediante inteligencia artificial se tratará como apoyo informativo no diagnóstico y se probará preferentemente con datos ficticios, sintéticos o seudonimizados, respetando principios de minimización y protección de información sensible (Ethical considerations and data protection principles for digital personal health records, 2022).</w:t>
+      </w:r>
+    </w:p>
+    <w:p>
+      <w:r>
+        <w:rPr>
+          <w:rFonts w:ascii="Times New Roman" w:hAnsi="Times New Roman"/>
+          <w:sz w:val="24"/>
+        </w:rPr>
+        <w:t>¿Cómo centralizar, organizar y consultar la información de salud personal de manera longitudinal, segura y accesible, incorporando herramientas de inteligencia artificial para apoyar la revisión de información seleccionada por el usuario sin sustituir la evaluación de un profesional de salud?</w:t>
       </w:r>
     </w:p>
     <w:p>
@@ -2778,8 +2596,8 @@
         <w:pStyle w:val="Heading1"/>
         <w:jc w:val="left"/>
       </w:pPr>
-      <w:bookmarkStart w:id="12" w:name="bookmark=id.u9aol9ksgzlw" w:colFirst="0" w:colLast="0"/>
-      <w:bookmarkEnd w:id="12"/>
+      <w:bookmarkStart w:id="7" w:name="bookmark=id.u9aol9ksgzlw" w:colFirst="0" w:colLast="0"/>
+      <w:bookmarkEnd w:id="7"/>
       <w:r>
         <w:rPr>
           <w:rFonts w:ascii="Arial" w:eastAsia="Arial" w:hAnsi="Arial" w:cs="Arial"/>
@@ -2805,7 +2623,7 @@
           <w:color w:val="000000"/>
           <w:sz w:val="24"/>
         </w:rPr>
-        <w:t xml:space="preserve">El proyecto puede desarrollarse con una inversión inicial moderada porque gran parte de las herramientas de programación, control de versiones, diseño y pruebas dispone de planes gratuitos, comunitarios o académicos. Los costos variables se concentrarán principalmente en infraestructura de alojamiento, almacenamiento de archivos, base de datos y consumo de la API de inteligencia artificial. Durante la etapa académica se utilizarán volúmenes reducidos de </w:t>
+        <w:t xml:space="preserve">El proyecto puede desarrollarse con una inversión inicial moderada porque gran parte de las herramientas de programación, control de versiones, diseño y pruebas dispone de planes </w:t>
       </w:r>
       <w:r>
         <w:rPr>
@@ -2814,12 +2632,12 @@
           <w:sz w:val="24"/>
         </w:rPr>
         <w:lastRenderedPageBreak/>
-        <w:t>información y ambientes de prueba, lo que permitirá controlar el gasto y evaluar alternativas antes de un eventual despliegue de mayor escala.</w:t>
-      </w:r>
-    </w:p>
-    <w:p>
-      <w:commentRangeStart w:id="15"/>
-      <w:commentRangeStart w:id="16"/>
+        <w:t>gratuitos, comunitarios o académicos. Los costos variables se concentrarán principalmente en infraestructura de alojamiento, almacenamiento de archivos, base de datos y consumo de la API de inteligencia artificial. Durante la etapa académica se utilizarán volúmenes reducidos de información y ambientes de prueba, lo que permitirá controlar el gasto y evaluar alternativas antes de un eventual despliegue de mayor escala.</w:t>
+      </w:r>
+    </w:p>
+    <w:p>
+      <w:commentRangeStart w:id="8"/>
+      <w:commentRangeStart w:id="9"/>
       <w:r>
         <w:rPr>
           <w:rFonts w:ascii="Times New Roman" w:hAnsi="Times New Roman"/>
@@ -2827,23 +2645,23 @@
         </w:rPr>
         <w:t>La arquitectura desacoplada también favorece la sostenibilidad económica, ya que permite cambiar proveedores de almacenamiento o inteligencia artificial sin reconstruir toda la aplicación. Durante la fase académica, el prototipo se ofrecerá sin costo únicamente a los participantes de la evaluación; sus costos serán cubiertos por los recursos definidos para el proyecto y por el uso de ambientes de prueba de bajo volumen. No se plantea el prototipo como un servicio público permanente ni se define una modalidad comercial en esta etapa. La estimación de costos incluirá dominio, hospedaje, copias de seguridad, almacenamiento, consumo de API y mantenimiento, y documentará escenarios de crecimiento para una futura decisión de sostenibilidad antes de cualquier despliegue masivo.</w:t>
       </w:r>
-      <w:commentRangeEnd w:id="15"/>
+      <w:commentRangeEnd w:id="8"/>
       <w:r>
         <w:rPr>
           <w:rStyle w:val="CommentReference"/>
           <w:sz w:val="22"/>
           <w:szCs w:val="22"/>
         </w:rPr>
-        <w:commentReference w:id="15"/>
-      </w:r>
-      <w:commentRangeEnd w:id="16"/>
+        <w:commentReference w:id="8"/>
+      </w:r>
+      <w:commentRangeEnd w:id="9"/>
       <w:r>
         <w:rPr>
           <w:rStyle w:val="CommentReference"/>
           <w:sz w:val="22"/>
           <w:szCs w:val="22"/>
         </w:rPr>
-        <w:commentReference w:id="16"/>
+        <w:commentReference w:id="9"/>
       </w:r>
     </w:p>
     <w:p>
@@ -2905,7 +2723,16 @@
           <w:color w:val="000000"/>
           <w:sz w:val="24"/>
         </w:rPr>
-        <w:t>. De esta manera, la propuesta pretende combinar utilidad tecnológica con precauciones que reduzcan interpretaciones inadecuadas y promuevan el uso informado del sistema.</w:t>
+        <w:t xml:space="preserve">. De esta manera, la propuesta pretende </w:t>
+      </w:r>
+      <w:r>
+        <w:rPr>
+          <w:rFonts w:ascii="Times New Roman" w:hAnsi="Times New Roman"/>
+          <w:color w:val="000000"/>
+          <w:sz w:val="24"/>
+        </w:rPr>
+        <w:lastRenderedPageBreak/>
+        <w:t>combinar utilidad tecnológica con precauciones que reduzcan interpretaciones inadecuadas y promuevan el uso informado del sistema.</w:t>
       </w:r>
     </w:p>
     <w:p>
@@ -2924,7 +2751,7 @@
           <w:rFonts w:ascii="Times New Roman" w:hAnsi="Times New Roman"/>
           <w:sz w:val="24"/>
         </w:rPr>
-        <w:t>La propuesta es técnicamente viable porque se apoya en una arquitectura móvil cliente-servidor y en tecnologías con documentación amplia para autenticación, persistencia de datos, validación de entradas y construcción de interfaces. React Native permitirá desarrollar una aplicación para Android y iOS a partir de una base de código compartida, manteniendo componentes de interfaz nativos y una experiencia adaptada a dispositivos móviles (React Native Documentation, 2026). Node.js con Express.js se utilizará para implementar la API y la lógica del servidor, mientras que MySQL gestionará la información estructurada del sistema (Node.js Documentation, 2026; Express.js Documentation, 2026; MySQL Reference Manual, 2026). Los documentos clínicos se mantendrán fuera de la base de datos transaccional en almacenamiento privado, conservando metadatos y permisos dentro del sistema.</w:t>
+        <w:t>La propuesta es técnicamente viable porque se apoya en una arquitectura cliente-servidor multiplataforma y en tecnologías con documentación amplia para autenticación, persistencia de datos, validación de entradas y construcción de interfaces. React Native, complementado con React Native Web, permitirá desarrollar una solución para Android y navegadores web a partir de una base de código ampliamente compartida, adaptando la interfaz a las características de cada plataforma (React Native Documentation, 2026; React Native for Web Documentation, 2026). Node.js con Express.js se utilizará para implementar la API y la lógica del servidor, mientras que MySQL gestionará la información estructurada del sistema (Node.js Documentation, 2026; Express.js Documentation, 2026; MySQL Reference Manual, 2026). Los documentos clínicos se mantendrán fuera de la base de datos transaccional en almacenamiento privado, conservando metadatos y permisos dentro del sistema.</w:t>
       </w:r>
     </w:p>
     <w:p>
@@ -2942,14 +2769,13 @@
         <w:pStyle w:val="Heading1"/>
         <w:jc w:val="left"/>
       </w:pPr>
-      <w:bookmarkStart w:id="18" w:name="bookmark=id.v9vj2ir2owrb" w:colFirst="0" w:colLast="0"/>
-      <w:bookmarkEnd w:id="18"/>
+      <w:bookmarkStart w:id="10" w:name="bookmark=id.v9vj2ir2owrb" w:colFirst="0" w:colLast="0"/>
+      <w:bookmarkEnd w:id="10"/>
       <w:r>
         <w:rPr>
           <w:rFonts w:ascii="Arial" w:eastAsia="Arial" w:hAnsi="Arial" w:cs="Arial"/>
           <w:color w:val="000000"/>
         </w:rPr>
-        <w:lastRenderedPageBreak/>
         <w:t>4 OBJETIVOS</w:t>
       </w:r>
     </w:p>
@@ -2959,8 +2785,8 @@
         <w:ind w:firstLine="357"/>
         <w:jc w:val="left"/>
       </w:pPr>
-      <w:bookmarkStart w:id="19" w:name="bookmark=id.767yeothtctq" w:colFirst="0" w:colLast="0"/>
-      <w:bookmarkEnd w:id="19"/>
+      <w:bookmarkStart w:id="11" w:name="bookmark=id.767yeothtctq" w:colFirst="0" w:colLast="0"/>
+      <w:bookmarkEnd w:id="11"/>
       <w:r>
         <w:rPr>
           <w:rFonts w:ascii="Arial" w:eastAsia="Arial" w:hAnsi="Arial" w:cs="Arial"/>
@@ -2970,15 +2796,13 @@
       </w:r>
     </w:p>
     <w:p>
-      <w:commentRangeStart w:id="20"/>
-      <w:r>
-        <w:rPr>
-          <w:rFonts w:ascii="Times New Roman" w:hAnsi="Times New Roman"/>
-          <w:sz w:val="24"/>
-        </w:rPr>
-        <w:t>Desarrollar una aplicación móvil multiplataforma de historia clínica personal que permita centralizar, organizar y consultar longitudinalmente la información de salud del usuario, incorporando herramientas de inteligencia artificial para apoyar la revisión de información seleccionada, sin sustituir la evaluación y el criterio de un profesional de la salud.</w:t>
-      </w:r>
-      <w:commentRangeEnd w:id="20"/>
+      <w:r>
+        <w:rPr>
+          <w:rFonts w:ascii="Times New Roman" w:hAnsi="Times New Roman"/>
+          <w:sz w:val="24"/>
+        </w:rPr>
+        <w:t>Desarrollar una aplicación multiplataforma para Android y web de historia clínica personal que permita centralizar, organizar y consultar longitudinalmente la información de salud del usuario, incorporando herramientas de inteligencia artificial para apoyar la revisión de información seleccionada, sin sustituir la evaluación y el criterio de un profesional de la salud.</w:t>
+      </w:r>
     </w:p>
     <w:p>
       <w:pPr>
@@ -2986,17 +2810,18 @@
         <w:ind w:firstLine="357"/>
         <w:jc w:val="left"/>
       </w:pPr>
-      <w:bookmarkStart w:id="21" w:name="bookmark=id.754ip4grg66c" w:colFirst="0" w:colLast="0"/>
-      <w:bookmarkEnd w:id="21"/>
-      <w:commentRangeStart w:id="22"/>
+      <w:bookmarkStart w:id="12" w:name="bookmark=id.754ip4grg66c" w:colFirst="0" w:colLast="0"/>
+      <w:bookmarkEnd w:id="12"/>
+      <w:commentRangeStart w:id="13"/>
       <w:r>
         <w:rPr>
           <w:rFonts w:ascii="Arial" w:eastAsia="Arial" w:hAnsi="Arial" w:cs="Arial"/>
           <w:color w:val="000000"/>
         </w:rPr>
+        <w:lastRenderedPageBreak/>
         <w:t xml:space="preserve">4.2 </w:t>
       </w:r>
-      <w:commentRangeStart w:id="23"/>
+      <w:commentRangeStart w:id="14"/>
       <w:r>
         <w:rPr>
           <w:rFonts w:ascii="Arial" w:eastAsia="Arial" w:hAnsi="Arial" w:cs="Arial"/>
@@ -3004,23 +2829,23 @@
         </w:rPr>
         <w:t>OBJETIVOS ESPECÍFICOS</w:t>
       </w:r>
-      <w:commentRangeEnd w:id="23"/>
+      <w:commentRangeEnd w:id="14"/>
       <w:r>
         <w:rPr>
           <w:rStyle w:val="CommentReference"/>
           <w:sz w:val="22"/>
           <w:szCs w:val="22"/>
         </w:rPr>
-        <w:commentReference w:id="23"/>
-      </w:r>
-      <w:commentRangeEnd w:id="22"/>
+        <w:commentReference w:id="14"/>
+      </w:r>
+      <w:commentRangeEnd w:id="13"/>
       <w:r>
         <w:rPr>
           <w:rStyle w:val="CommentReference"/>
           <w:sz w:val="22"/>
           <w:szCs w:val="22"/>
         </w:rPr>
-        <w:commentReference w:id="22"/>
+        <w:commentReference w:id="13"/>
       </w:r>
     </w:p>
     <w:p>
@@ -3039,11 +2864,11 @@
           <w:color w:val="000000"/>
         </w:rPr>
       </w:pPr>
-      <w:commentRangeStart w:id="24"/>
+      <w:commentRangeStart w:id="15"/>
       <w:r>
         <w:t>Implementar mecanismos de autenticación, autorización y administración de perfiles propios o dependientes, de modo que cada usuario acceda únicamente a la información para la que posee permisos.</w:t>
       </w:r>
-      <w:commentRangeEnd w:id="24"/>
+      <w:commentRangeEnd w:id="15"/>
       <w:r>
         <w:rPr>
           <w:rStyle w:val="CommentReference"/>
@@ -3051,7 +2876,7 @@
           <w:sz w:val="22"/>
           <w:szCs w:val="22"/>
         </w:rPr>
-        <w:commentReference w:id="24"/>
+        <w:commentReference w:id="15"/>
       </w:r>
     </w:p>
     <w:p>
@@ -3070,11 +2895,11 @@
           <w:color w:val="000000"/>
         </w:rPr>
       </w:pPr>
-      <w:commentRangeStart w:id="25"/>
+      <w:commentRangeStart w:id="16"/>
       <w:r>
         <w:t>Desarrollar el registro, la clasificación y la consulta de antecedentes, eventos de salud, resultados de laboratorio, archivos PDF y fotografías o imágenes digitalizadas de documentos clínicos, asociados a fechas y categorías del historial.</w:t>
       </w:r>
-      <w:commentRangeEnd w:id="25"/>
+      <w:commentRangeEnd w:id="16"/>
       <w:r>
         <w:rPr>
           <w:rStyle w:val="CommentReference"/>
@@ -3082,7 +2907,7 @@
           <w:sz w:val="22"/>
           <w:szCs w:val="22"/>
         </w:rPr>
-        <w:commentReference w:id="25"/>
+        <w:commentReference w:id="16"/>
       </w:r>
     </w:p>
     <w:p>
@@ -3101,11 +2926,11 @@
           <w:color w:val="000000"/>
         </w:rPr>
       </w:pPr>
-      <w:commentRangeStart w:id="26"/>
+      <w:commentRangeStart w:id="17"/>
       <w:r>
         <w:t>Desarrollar una línea de tiempo que permita localizar antecedentes y consultar la evolución cronológica de la información de salud personal mediante mecanismos de búsqueda y filtrado.</w:t>
       </w:r>
-      <w:commentRangeEnd w:id="26"/>
+      <w:commentRangeEnd w:id="17"/>
       <w:r>
         <w:rPr>
           <w:rStyle w:val="CommentReference"/>
@@ -3113,7 +2938,7 @@
           <w:sz w:val="22"/>
           <w:szCs w:val="22"/>
         </w:rPr>
-        <w:commentReference w:id="26"/>
+        <w:commentReference w:id="17"/>
       </w:r>
     </w:p>
     <w:p>
@@ -3132,12 +2957,12 @@
           <w:color w:val="000000"/>
         </w:rPr>
       </w:pPr>
-      <w:commentRangeStart w:id="27"/>
-      <w:commentRangeStart w:id="28"/>
+      <w:commentRangeStart w:id="18"/>
+      <w:commentRangeStart w:id="19"/>
       <w:r>
         <w:t>Implementar una funcionalidad de inteligencia artificial que, a partir de información seleccionada por el usuario, genere un resumen no diagnóstico y señale posibles datos incompletos o contradictorios del registro, mostrando sus limitaciones y sin emitir recomendaciones clínicas.</w:t>
       </w:r>
-      <w:commentRangeEnd w:id="28"/>
+      <w:commentRangeEnd w:id="19"/>
       <w:r>
         <w:rPr>
           <w:rStyle w:val="CommentReference"/>
@@ -3145,9 +2970,9 @@
           <w:sz w:val="22"/>
           <w:szCs w:val="22"/>
         </w:rPr>
-        <w:commentReference w:id="28"/>
-      </w:r>
-      <w:commentRangeEnd w:id="27"/>
+        <w:commentReference w:id="19"/>
+      </w:r>
+      <w:commentRangeEnd w:id="18"/>
       <w:r>
         <w:rPr>
           <w:rStyle w:val="CommentReference"/>
@@ -3155,7 +2980,7 @@
           <w:sz w:val="22"/>
           <w:szCs w:val="22"/>
         </w:rPr>
-        <w:commentReference w:id="27"/>
+        <w:commentReference w:id="18"/>
       </w:r>
     </w:p>
     <w:p>
@@ -3174,19 +2999,8 @@
           <w:color w:val="000000"/>
         </w:rPr>
       </w:pPr>
-      <w:commentRangeStart w:id="29"/>
-      <w:r>
-        <w:t>Evaluar el prototipo mediante pruebas funcionales, tareas de usabilidad, un cuestionario estandarizado de usabilidad y una rúbrica de verificación de las salidas de inteligencia artificial con datos ficticios o sintéticos.</w:t>
-      </w:r>
-      <w:commentRangeEnd w:id="29"/>
-      <w:r>
-        <w:rPr>
-          <w:rStyle w:val="CommentReference"/>
-          <w:color w:val="000000"/>
-          <w:sz w:val="22"/>
-          <w:szCs w:val="22"/>
-        </w:rPr>
-        <w:commentReference w:id="29"/>
+      <w:r>
+        <w:t>Evaluar el prototipo en sus versiones Android y web mediante pruebas funcionales, tareas de usabilidad, un cuestionario estandarizado de usabilidad y una rúbrica de verificación de las salidas de inteligencia artificial con datos ficticios o sintéticos.</w:t>
       </w:r>
     </w:p>
     <w:p>
@@ -3208,25 +3022,29 @@
       </w:r>
     </w:p>
     <w:p>
-      <w:commentRangeStart w:id="33"/>
-      <w:commentRangeStart w:id="34"/>
-      <w:r>
-        <w:rPr>
-          <w:rFonts w:ascii="Times New Roman" w:hAnsi="Times New Roman"/>
-          <w:sz w:val="24"/>
-        </w:rPr>
-        <w:t>El proyecto abarcará el diseño, construcción y evaluación académica de una aplicación móvil multiplataforma de uso personal destinada a mantener un historial de salud longitudinal. La primera versión permitirá registrar información estructurada y documentos, relacionarlos con fechas y eventos, y consultarlos desde una línea de tiempo. El sistema también ofrecerá una vista estructurada —no generada por inteligencia artificial— para preparar información relevante antes de una consulta. El acceso se realizará mediante cuentas autenticadas y se contemplarán perfiles dependientes administrados por un representante autorizado.</w:t>
-      </w:r>
-      <w:commentRangeEnd w:id="34"/>
-      <w:commentRangeEnd w:id="33"/>
-    </w:p>
-    <w:p>
-      <w:r>
-        <w:rPr>
-          <w:rFonts w:ascii="Times New Roman" w:hAnsi="Times New Roman"/>
-          <w:sz w:val="24"/>
-        </w:rPr>
-        <w:t>El alcance funcional incluirá la gestión de antecedentes de salud, alergias, vacunas, medicamentos, cirugías, consultas, diagnósticos declarados, tratamientos y resultados de laboratorio. Los documentos clínicos podrán almacenarse como archivos privados vinculados a eventos del historial; se aceptarán archivos PDF y fotografías o imágenes digitalizadas de documentos, sin realizar interpretación automática de imágenes diagnósticas. El usuario podrá aplicar filtros por fecha, categoría y palabras clave para consultar su información.</w:t>
+      <w:r>
+        <w:rPr>
+          <w:rFonts w:ascii="Times New Roman" w:hAnsi="Times New Roman"/>
+          <w:sz w:val="24"/>
+        </w:rPr>
+        <w:t>El proyecto abarcará el diseño, construcción y evaluación académica de una aplicación multiplataforma para Android y web de uso personal destinada a mantener un historial de salud longitudinal. La primera versión permitirá registrar información estructurada y documentos, relacionarlos con fechas y eventos, y consultarlos desde una línea de tiempo. El sistema también ofrecerá una vista estructurada —no generada por inteligencia artificial— para preparar información relevante antes de una consulta. El acceso se realizará mediante cuentas autenticadas y se contemplarán perfiles dependientes administrados por un representante autorizado.</w:t>
+      </w:r>
+    </w:p>
+    <w:p>
+      <w:r>
+        <w:rPr>
+          <w:rFonts w:ascii="Times New Roman" w:hAnsi="Times New Roman"/>
+          <w:sz w:val="24"/>
+        </w:rPr>
+        <w:t xml:space="preserve">El alcance funcional incluirá la gestión de antecedentes de salud, alergias, vacunas, medicamentos, cirugías, consultas, diagnósticos declarados, tratamientos y resultados de laboratorio. Los documentos clínicos podrán almacenarse como archivos privados vinculados a eventos del historial; se aceptarán archivos PDF y fotografías o imágenes digitalizadas de </w:t>
+      </w:r>
+      <w:r>
+        <w:rPr>
+          <w:rFonts w:ascii="Times New Roman" w:hAnsi="Times New Roman"/>
+          <w:sz w:val="24"/>
+        </w:rPr>
+        <w:lastRenderedPageBreak/>
+        <w:t>documentos, sin realizar interpretación automática de imágenes diagnósticas. El usuario podrá aplicar filtros por fecha, categoría y palabras clave para consultar su información.</w:t>
       </w:r>
     </w:p>
     <w:p>
@@ -3270,8 +3088,8 @@
       </w:r>
     </w:p>
     <w:p>
-      <w:commentRangeStart w:id="35"/>
-      <w:commentRangeStart w:id="36"/>
+      <w:commentRangeStart w:id="20"/>
+      <w:commentRangeStart w:id="21"/>
       <w:r>
         <w:rPr>
           <w:rFonts w:ascii="Times New Roman" w:hAnsi="Times New Roman"/>
@@ -3279,23 +3097,23 @@
         </w:rPr>
         <w:t>Como parte de la ingeniería del prototipo se incluirá un registro de acciones relevantes de seguridad y trazabilidad, necesario para verificar accesos y operaciones sobre la información. La exportación de información, la gestión de consentimientos dentro de la aplicación, la interoperabilidad institucional y la adopción de HL7 FHIR quedarán como posibilidades de evolución futura y no formarán parte de las funcionalidades evaluadas en esta primera versión.</w:t>
       </w:r>
-      <w:commentRangeEnd w:id="36"/>
+      <w:commentRangeEnd w:id="21"/>
       <w:r>
         <w:rPr>
           <w:rStyle w:val="CommentReference"/>
           <w:sz w:val="22"/>
           <w:szCs w:val="22"/>
         </w:rPr>
-        <w:commentReference w:id="36"/>
-      </w:r>
-      <w:commentRangeEnd w:id="35"/>
+        <w:commentReference w:id="21"/>
+      </w:r>
+      <w:commentRangeEnd w:id="20"/>
       <w:r>
         <w:rPr>
           <w:rStyle w:val="CommentReference"/>
           <w:sz w:val="22"/>
           <w:szCs w:val="22"/>
         </w:rPr>
-        <w:commentReference w:id="35"/>
+        <w:commentReference w:id="20"/>
       </w:r>
     </w:p>
     <w:p>
@@ -3371,16 +3189,15 @@
           <w:color w:val="000000"/>
         </w:rPr>
       </w:pPr>
-      <w:commentRangeStart w:id="38"/>
-      <w:r>
-        <w:rPr>
-          <w:rFonts w:ascii="Times New Roman" w:hAnsi="Times New Roman"/>
-          <w:sz w:val="24"/>
-        </w:rPr>
-        <w:lastRenderedPageBreak/>
+      <w:commentRangeStart w:id="22"/>
+      <w:r>
+        <w:rPr>
+          <w:rFonts w:ascii="Times New Roman" w:hAnsi="Times New Roman"/>
+          <w:sz w:val="24"/>
+        </w:rPr>
         <w:t>• La inteligencia artificial no emitirá diagnósticos, factores de riesgo, prescripciones, indicaciones de tratamiento, recomendaciones de estudios, triaje de emergencias ni decisiones clínicas autónomas.</w:t>
       </w:r>
-      <w:commentRangeEnd w:id="38"/>
+      <w:commentRangeEnd w:id="22"/>
       <w:r>
         <w:rPr>
           <w:rStyle w:val="CommentReference"/>
@@ -3388,7 +3205,7 @@
           <w:sz w:val="22"/>
           <w:szCs w:val="22"/>
         </w:rPr>
-        <w:commentReference w:id="38"/>
+        <w:commentReference w:id="22"/>
       </w:r>
     </w:p>
     <w:p>
@@ -3445,6 +3262,7 @@
           <w:color w:val="000000"/>
           <w:sz w:val="24"/>
         </w:rPr>
+        <w:lastRenderedPageBreak/>
         <w:t>• La calidad de los análisis dependerá de la exactitud, actualidad y completitud de la información registrada por el usuario.</w:t>
       </w:r>
     </w:p>
@@ -3620,25 +3438,24 @@
           <w:color w:val="000000"/>
           <w:sz w:val="24"/>
         </w:rPr>
-        <w:t xml:space="preserve">. Aunque la primera versión del sistema propuesto no se conectará con </w:t>
-      </w:r>
-      <w:r>
-        <w:rPr>
-          <w:rFonts w:ascii="Times New Roman" w:hAnsi="Times New Roman"/>
-          <w:color w:val="000000"/>
+        <w:t>. Aunque la primera versión del sistema propuesto no se conectará con instituciones externas, considerar conceptos de interoperabilidad desde el modelo de datos permite evitar una estructura cerrada y preparar futuras estrategias de intercambio. Este enfoque se alinea con la evolución de la salud digital hacia ecosistemas donde la información debe poder reutilizarse de forma segura y comprensible.</w:t>
+      </w:r>
+    </w:p>
+    <w:p>
+      <w:r>
+        <w:rPr>
+          <w:rFonts w:ascii="Times New Roman" w:hAnsi="Times New Roman"/>
+          <w:sz w:val="24"/>
+        </w:rPr>
+        <w:t xml:space="preserve">La incorporación de inteligencia artificial a aplicaciones de salud ha ampliado las posibilidades de resumir información y asistir procesos de revisión. Al mismo tiempo, los organismos internacionales advierten que estos modelos pueden producir resultados incorrectos, reproducir sesgos o manejar datos sensibles de manera inadecuada si no existen controles de gobernanza y </w:t>
+      </w:r>
+      <w:r>
+        <w:rPr>
+          <w:rFonts w:ascii="Times New Roman" w:hAnsi="Times New Roman"/>
           <w:sz w:val="24"/>
         </w:rPr>
         <w:lastRenderedPageBreak/>
-        <w:t>instituciones externas, considerar conceptos de interoperabilidad desde el modelo de datos permite evitar una estructura cerrada y preparar futuras estrategias de intercambio. Este enfoque se alinea con la evolución de la salud digital hacia ecosistemas donde la información debe poder reutilizarse de forma segura y comprensible.</w:t>
-      </w:r>
-    </w:p>
-    <w:p>
-      <w:r>
-        <w:rPr>
-          <w:rFonts w:ascii="Times New Roman" w:hAnsi="Times New Roman"/>
-          <w:sz w:val="24"/>
-        </w:rPr>
-        <w:t xml:space="preserve">La incorporación de inteligencia artificial a aplicaciones de salud ha ampliado las posibilidades de resumir información y asistir procesos de revisión. Al mismo tiempo, los organismos internacionales advierten que estos modelos pueden producir resultados incorrectos, reproducir sesgos o manejar datos sensibles de manera inadecuada si no existen controles de gobernanza y supervisión humana </w:t>
+        <w:t xml:space="preserve">supervisión humana </w:t>
       </w:r>
       <w:r>
         <w:fldChar w:fldCharType="begin"/>
@@ -3760,6 +3577,7 @@
         <w:jc w:val="left"/>
       </w:pPr>
       <w:r>
+        <w:lastRenderedPageBreak/>
         <w:t>6.1.3 SALUD DIGITAL</w:t>
       </w:r>
     </w:p>
@@ -3873,15 +3691,7 @@
           <w:rFonts w:ascii="Times New Roman" w:hAnsi="Times New Roman"/>
           <w:sz w:val="24"/>
         </w:rPr>
-        <w:t xml:space="preserve">La prevención busca identificar oportunidades para actuar antes de que un problema avance o se complique. Dentro de la aplicación, este principio no se traducirá en diagnósticos automáticos ni en la identificación de factores de riesgo, sino en funciones que ayuden a revisar antecedentes, destacar datos incompletos o contradictorios dentro del registro y preparar preguntas informativas que podrían ser consultadas con un profesional. La decisión clínica seguirá </w:t>
-      </w:r>
-      <w:r>
-        <w:rPr>
-          <w:rFonts w:ascii="Times New Roman" w:hAnsi="Times New Roman"/>
-          <w:sz w:val="24"/>
-        </w:rPr>
-        <w:lastRenderedPageBreak/>
-        <w:t>correspondiendo al personal de salud, mientras que el sistema actuará como apoyo informativo para mejorar la preparación y continuidad de la información.</w:t>
+        <w:t>La prevención busca identificar oportunidades para actuar antes de que un problema avance o se complique. Dentro de la aplicación, este principio no se traducirá en diagnósticos automáticos ni en la identificación de factores de riesgo, sino en funciones que ayuden a revisar antecedentes, destacar datos incompletos o contradictorios dentro del registro y preparar preguntas informativas que podrían ser consultadas con un profesional. La decisión clínica seguirá correspondiendo al personal de salud, mientras que el sistema actuará como apoyo informativo para mejorar la preparación y continuidad de la información.</w:t>
       </w:r>
     </w:p>
     <w:p>
@@ -3900,7 +3710,15 @@
           <w:rFonts w:ascii="Times New Roman" w:hAnsi="Times New Roman"/>
           <w:sz w:val="24"/>
         </w:rPr>
-        <w:t xml:space="preserve">Los modelos de lenguaje pueden analizar texto, resumir información y generar respuestas a partir de instrucciones y contexto. En salud, estas capacidades deben emplearse con precaución porque una respuesta lingüísticamente convincente puede ser incorrecta o incompleta. Las guías de gobernanza de inteligencia artificial para salud recomiendan transparencia, supervisión humana, protección de datos y evaluación de riesgos </w:t>
+        <w:t xml:space="preserve">Los modelos de lenguaje pueden analizar texto, resumir información y generar respuestas a partir de instrucciones y contexto. En salud, estas capacidades deben emplearse con precaución porque una respuesta lingüísticamente convincente puede ser incorrecta o incompleta. Las guías de gobernanza de inteligencia artificial para salud recomiendan transparencia, supervisión </w:t>
+      </w:r>
+      <w:r>
+        <w:rPr>
+          <w:rFonts w:ascii="Times New Roman" w:hAnsi="Times New Roman"/>
+          <w:sz w:val="24"/>
+        </w:rPr>
+        <w:lastRenderedPageBreak/>
+        <w:t xml:space="preserve">humana, protección de datos y evaluación de riesgos </w:t>
       </w:r>
       <w:r>
         <w:fldChar w:fldCharType="begin"/>
@@ -4003,7 +3821,7 @@
           <w:color w:val="000000"/>
           <w:sz w:val="24"/>
         </w:rPr>
-        <w:t>El marco técnico describe las tecnologías y decisiones de arquitectura que permitirán implementar el prototipo. La selección busca mantener un ecosistema coherente para desarrollo móvil, servicios backend, persistencia relacional, almacenamiento de documentos, control de versiones y consumo de servicios de inteligencia artificial. Cada herramienta se incorpora por una función específica y no como objetivo del proyecto en sí mismo.</w:t>
+        <w:t>El marco técnico describe las tecnologías y decisiones de arquitectura que permitirán implementar el prototipo. La selección busca mantener un ecosistema coherente para desarrollo multiplataforma en Android y web, servicios backend, persistencia relacional, almacenamiento de documentos, control de versiones y consumo de servicios de inteligencia artificial. Cada herramienta se incorpora por una función específica y no como objetivo del proyecto en sí mismo.</w:t>
       </w:r>
     </w:p>
     <w:p>
@@ -4021,17 +3839,17 @@
         <w:jc w:val="left"/>
       </w:pPr>
       <w:r>
-        <w:t>6.2.1.1 React Native</w:t>
-      </w:r>
-    </w:p>
-    <w:p>
-      <w:r>
-        <w:rPr>
-          <w:rFonts w:ascii="Times New Roman" w:hAnsi="Times New Roman"/>
-          <w:color w:val="000000"/>
-          <w:sz w:val="24"/>
-        </w:rPr>
-        <w:t>La interfaz móvil se construirá con React Native, framework que permite desarrollar aplicaciones para Android y iOS mediante JavaScript y componentes reutilizables, manteniendo acceso a capacidades nativas del dispositivo (React Native Documentation, 2026). La navegación, formularios, línea de tiempo, carga de documentos y visualización de resultados se implementarán como pantallas y componentes móviles. El diseño priorizará consistencia visual, adaptación a diferentes tamaños de pantalla, mensajes de validación claros y reutilización de componentes para reducir errores de uso.</w:t>
+        <w:t>6.2.1.1 React Native y React Native Web</w:t>
+      </w:r>
+    </w:p>
+    <w:p>
+      <w:r>
+        <w:rPr>
+          <w:rFonts w:ascii="Times New Roman" w:hAnsi="Times New Roman"/>
+          <w:color w:val="000000"/>
+          <w:sz w:val="24"/>
+        </w:rPr>
+        <w:t>La interfaz se construirá con React Native y React Native Web, permitiendo reutilizar componentes y lógica entre la aplicación Android y la versión web accesible desde navegadores modernos. La navegación, formularios, línea de tiempo, carga de documentos y visualización de resultados se implementarán como componentes adaptables a ambas plataformas. El diseño priorizará consistencia visual, adaptación a diferentes tamaños de pantalla, mensajes de validación claros y reutilización de componentes para reducir errores de uso (React Native Documentation, 2026; React Native for Web Documentation, 2026).</w:t>
       </w:r>
     </w:p>
     <w:p>
@@ -4039,6 +3857,7 @@
         <w:pStyle w:val="Heading3"/>
       </w:pPr>
       <w:r>
+        <w:lastRenderedPageBreak/>
         <w:t>6.2.2 TECNOLOGÍAS DE BACKEND</w:t>
       </w:r>
     </w:p>
@@ -4059,7 +3878,7 @@
           <w:color w:val="000000"/>
           <w:sz w:val="24"/>
         </w:rPr>
-        <w:t>Node.js se utilizará como entorno de ejecución del backend para implementar la lógica de negocio, autenticación, autorización, validaciones, acceso a datos e integración con servicios externos (Node.js Documentation, 2026). Express.js permitirá estructurar la API HTTP que consumirá la aplicación React Native, organizando rutas, middleware y controladores para separar responsabilidades y facilitar las pruebas (Express.js Documentation, 2026). Esta arquitectura mantendrá desacoplada la aplicación móvil del servidor y facilitará la evolución independiente de ambos componentes.</w:t>
+        <w:t>Node.js se utilizará como entorno de ejecución del backend para implementar la lógica de negocio, autenticación, autorización, validaciones, acceso a datos e integración con servicios externos (Node.js Documentation, 2026). Express.js permitirá estructurar la API HTTP que consumirán tanto la aplicación Android como la versión web, organizando rutas, middleware y controladores para separar responsabilidades y facilitar las pruebas (Express.js Documentation, 2026). Esta arquitectura mantendrá desacopladas las interfaces cliente del servidor y facilitará la evolución independiente de los componentes.</w:t>
       </w:r>
     </w:p>
     <w:p>
@@ -4079,7 +3898,7 @@
           <w:color w:val="000000"/>
           <w:sz w:val="24"/>
         </w:rPr>
-        <w:t>DeepSeek ofrece una API para integrar modelos de lenguaje mediante solicitudes autenticadas (DeepSeek API Docs, 2026). En el proyecto, las solicitudes se enviarán exclusivamente desde el backend y nunca directamente desde la aplicación móvil. Un adaptador interno preparará el contexto mínimo, eliminará identificadores directos cuando sea posible, aplicará instrucciones que prohíban presentar diagnósticos como hechos y validará la respuesta antes de mostrarla al usuario.</w:t>
+        <w:t>DeepSeek ofrece una API para integrar modelos de lenguaje mediante solicitudes autenticadas (DeepSeek API Docs, 2026). En el proyecto, las solicitudes se enviarán exclusivamente desde el backend y nunca directamente desde los clientes Android o web. Un adaptador interno preparará el contexto mínimo, eliminará identificadores directos cuando sea posible, aplicará instrucciones que prohíban presentar diagnósticos como hechos y validará la respuesta antes de mostrarla al usuario.</w:t>
       </w:r>
     </w:p>
     <w:p>
@@ -4095,9 +3914,6 @@
         <w:pStyle w:val="Heading4"/>
         <w:ind w:firstLine="1077"/>
         <w:jc w:val="left"/>
-        <w:rPr>
-          <w:lang w:val="en-US"/>
-        </w:rPr>
       </w:pPr>
       <w:r>
         <w:t>6.2.3.1 MySQL</w:t>
@@ -4118,6 +3934,7 @@
         <w:pStyle w:val="Heading3"/>
       </w:pPr>
       <w:r>
+        <w:lastRenderedPageBreak/>
         <w:t>6.2.4 CONTROL DE VERSIONES Y COLABORACIÓN</w:t>
       </w:r>
     </w:p>
@@ -4230,45 +4047,44 @@
           <w:color w:val="000000"/>
           <w:sz w:val="24"/>
         </w:rPr>
-        <w:t xml:space="preserve">Los documentos clínicos, imágenes y archivos PDF se almacenarán en un servicio privado de objetos en la nube, separado de las tablas transaccionales. La base de datos conservará metadatos, identificadores y permisos necesarios para localizar cada archivo. El proveedor se definirá durante la implementación según costo y disponibilidad, pero deberá soportar </w:t>
-      </w:r>
-      <w:r>
-        <w:rPr>
-          <w:rFonts w:ascii="Times New Roman" w:hAnsi="Times New Roman"/>
-          <w:color w:val="000000"/>
+        <w:t>Los documentos clínicos, imágenes y archivos PDF se almacenarán en un servicio privado de objetos en la nube, separado de las tablas transaccionales. La base de datos conservará metadatos, identificadores y permisos necesarios para localizar cada archivo. El proveedor se definirá durante la implementación según costo y disponibilidad, pero deberá soportar transmisión cifrada, control de acceso, copias de seguridad y mecanismos que eviten la exposición pública de documentos por defecto.</w:t>
+      </w:r>
+    </w:p>
+    <w:p>
+      <w:r>
+        <w:rPr>
+          <w:rFonts w:ascii="Times New Roman" w:hAnsi="Times New Roman"/>
+          <w:color w:val="000000"/>
+          <w:sz w:val="24"/>
+        </w:rPr>
+        <w:t>La arquitectura se planteará como una solución multiplataforma cliente-servidor. La interfaz desarrollada con React Native y React Native Web dispondrá de una versión Android y una versión web; ambas consumirán una API implementada con Node.js y Express.js. El backend concentrará las reglas de negocio, validaciones, autenticación y autorización; MySQL almacenará los datos estructurados; el almacenamiento privado conservará documentos clínicos; y el módulo de inteligencia artificial se consumirá mediante un adaptador que controle qué información abandona el sistema. Esta separación permitirá modificar un servicio externo o una capa de la solución sin afectar innecesariamente los demás componentes y facilitará las pruebas de cada módulo.</w:t>
+      </w:r>
+    </w:p>
+    <w:p>
+      <w:r>
+        <w:rPr>
+          <w:rFonts w:ascii="Times New Roman" w:hAnsi="Times New Roman"/>
+          <w:sz w:val="24"/>
+        </w:rPr>
+        <w:t xml:space="preserve">El modelo de datos se organizará alrededor de un perfil de salud y sus eventos relacionados. Las entidades principales incluirán usuario, perfil de salud, evento de salud, antecedente, medicamento, vacuna, resultado de laboratorio, documento clínico, análisis de IA y registro de </w:t>
+      </w:r>
+      <w:r>
+        <w:rPr>
+          <w:rFonts w:ascii="Times New Roman" w:hAnsi="Times New Roman"/>
           <w:sz w:val="24"/>
         </w:rPr>
         <w:lastRenderedPageBreak/>
-        <w:t>transmisión cifrada, control de acceso, copias de seguridad y mecanismos que eviten la exposición pública de documentos por defecto.</w:t>
-      </w:r>
-    </w:p>
-    <w:p>
-      <w:r>
-        <w:rPr>
-          <w:rFonts w:ascii="Times New Roman" w:hAnsi="Times New Roman"/>
-          <w:color w:val="000000"/>
-          <w:sz w:val="24"/>
-        </w:rPr>
-        <w:t>La arquitectura se planteará como una solución móvil cliente-servidor. La aplicación desarrollada en React Native consumirá una API implementada con Node.js y Express.js; el backend concentrará las reglas de negocio, validaciones, autenticación y autorización; MySQL almacenará los datos estructurados; el almacenamiento privado conservará documentos clínicos; y el módulo de inteligencia artificial se consumirá mediante un adaptador que controle qué información abandona el sistema. Esta separación permitirá modificar un servicio externo o una capa de la solución sin afectar innecesariamente los demás componentes y facilitará las pruebas de cada módulo.</w:t>
-      </w:r>
-    </w:p>
-    <w:p>
-      <w:r>
-        <w:rPr>
-          <w:rFonts w:ascii="Times New Roman" w:hAnsi="Times New Roman"/>
-          <w:sz w:val="24"/>
-        </w:rPr>
-        <w:t>El modelo de datos se organizará alrededor de un perfil de salud y sus eventos relacionados. Las entidades principales incluirán usuario, perfil de salud, evento de salud, antecedente, medicamento, vacuna, resultado de laboratorio, documento clínico, análisis de IA y registro de auditoría. Se evitará concentrar todo el historial en una sola tabla, de manera que la evolución del sistema pueda mantenerse mediante relaciones explícitas y migraciones controladas.</w:t>
-      </w:r>
-    </w:p>
-    <w:p>
-      <w:r>
-        <w:rPr>
-          <w:rFonts w:ascii="Times New Roman" w:hAnsi="Times New Roman"/>
-          <w:color w:val="000000"/>
-          <w:sz w:val="24"/>
-        </w:rPr>
-        <w:t>La autenticación se implementará en el backend de Node.js mediante credenciales protegidas y mecanismos seguros de sesión o tokens, verificando también la autorización sobre cada recurso. De esta forma, conocer un identificador no será suficiente para acceder a un perfil o documento ajeno. La aplicación móvil almacenará únicamente los datos de sesión indispensables mediante mecanismos seguros del dispositivo. Se aplicarán controles de validación de entradas, protección de credenciales, gestión segura de archivos y registro de eventos relevantes tomando como referencia criterios verificables de OWASP ASVS (OWASP Application Security Verification Standard (ASVS) 5.0.0, 2025).</w:t>
+        <w:t>auditoría. Se evitará concentrar todo el historial en una sola tabla, de manera que la evolución del sistema pueda mantenerse mediante relaciones explícitas y migraciones controladas.</w:t>
+      </w:r>
+    </w:p>
+    <w:p>
+      <w:r>
+        <w:rPr>
+          <w:rFonts w:ascii="Times New Roman" w:hAnsi="Times New Roman"/>
+          <w:color w:val="000000"/>
+          <w:sz w:val="24"/>
+        </w:rPr>
+        <w:t>La autenticación se implementará en el backend de Node.js mediante credenciales protegidas y mecanismos seguros de sesión o tokens, verificando también la autorización sobre cada recurso. De esta forma, conocer un identificador no será suficiente para acceder a un perfil o documento ajeno. Los clientes Android y web almacenarán únicamente los datos de sesión indispensables mediante mecanismos adecuados para cada plataforma. Se aplicarán controles de validación de entradas, protección de credenciales, gestión segura de archivos y registro de eventos relevantes tomando como referencia criterios verificables de OWASP ASVS (OWASP Application Security Verification Standard (ASVS) 5.0.0, 2025).</w:t>
       </w:r>
     </w:p>
     <w:p>
@@ -4287,8 +4103,82 @@
           <w:color w:val="000000"/>
           <w:sz w:val="24"/>
         </w:rPr>
-        <w:t xml:space="preserve">El diseño de experiencia de usuario se orientará a que una persona no técnica pueda registrar y localizar información sin requerir conocimiento médico especializado ni conocimiento del funcionamiento interno del sistema. Se aplicará un enfoque centrado en las personas, </w:t>
-      </w:r>
+        <w:t xml:space="preserve">El diseño de experiencia de usuario se orientará a que una persona no técnica pueda registrar y localizar información sin requerir conocimiento médico especializado ni conocimiento del funcionamiento interno del sistema. Se aplicará un enfoque centrado en las personas, considerando tareas reales, contexto de uso y retroalimentación durante la construcción del prototipo </w:t>
+      </w:r>
+      <w:r>
+        <w:fldChar w:fldCharType="begin"/>
+      </w:r>
+      <w:r>
+        <w:instrText xml:space="preserve"> CITATION ISO2019 \l 3082 </w:instrText>
+      </w:r>
+      <w:r>
+        <w:fldChar w:fldCharType="separate"/>
+      </w:r>
+      <w:r>
+        <w:rPr>
+          <w:noProof/>
+        </w:rPr>
+        <w:t xml:space="preserve"> </w:t>
+      </w:r>
+      <w:r>
+        <w:rPr>
+          <w:noProof/>
+        </w:rPr>
+        <w:t>(ISO 9241-210:2019 Ergonomics of human-system interaction - Part 210: Human-centred design for interactive systems, 2019)</w:t>
+      </w:r>
+      <w:r>
+        <w:fldChar w:fldCharType="end"/>
+      </w:r>
+      <w:r>
+        <w:rPr>
+          <w:rFonts w:ascii="Times New Roman" w:hAnsi="Times New Roman"/>
+          <w:color w:val="000000"/>
+          <w:sz w:val="24"/>
+        </w:rPr>
+        <w:t>. La navegación deberá mantener términos consistentes y separar claramente acciones de consulta, edición, carga de documentos y análisis mediante inteligencia artificial.</w:t>
+      </w:r>
+    </w:p>
+    <w:p>
+      <w:r>
+        <w:rPr>
+          <w:rFonts w:ascii="Times New Roman" w:hAnsi="Times New Roman"/>
+          <w:sz w:val="24"/>
+        </w:rPr>
+        <w:t xml:space="preserve">La interfaz utilizará formularios progresivos, mensajes de validación comprensibles, filtros visibles y una línea de tiempo que reduzca la cantidad de pasos necesarios para recuperar antecedentes. Las salidas de inteligencia artificial se diferenciarán visualmente de los datos registrados por el usuario, indicando fecha de generación, información de origen y advertencia de carácter no diagnóstico. Los prototipos creados en Figma se utilizarán para revisar estas decisiones antes de implementar las pantallas definitivas </w:t>
+      </w:r>
+      <w:r>
+        <w:fldChar w:fldCharType="begin"/>
+      </w:r>
+      <w:r>
+        <w:instrText xml:space="preserve"> CITATION Figma2026 \l 3082 </w:instrText>
+      </w:r>
+      <w:r>
+        <w:fldChar w:fldCharType="separate"/>
+      </w:r>
+      <w:r>
+        <w:rPr>
+          <w:noProof/>
+        </w:rPr>
+        <w:t xml:space="preserve"> </w:t>
+      </w:r>
+      <w:r>
+        <w:rPr>
+          <w:noProof/>
+        </w:rPr>
+        <w:t>(Figma Design documentation, 2026)</w:t>
+      </w:r>
+      <w:r>
+        <w:fldChar w:fldCharType="end"/>
+      </w:r>
+      <w:r>
+        <w:rPr>
+          <w:rFonts w:ascii="Times New Roman" w:hAnsi="Times New Roman"/>
+          <w:sz w:val="24"/>
+        </w:rPr>
+        <w:t>.</w:t>
+      </w:r>
+    </w:p>
+    <w:p>
       <w:r>
         <w:rPr>
           <w:rFonts w:ascii="Times New Roman" w:hAnsi="Times New Roman"/>
@@ -4296,89 +4186,7 @@
           <w:sz w:val="24"/>
         </w:rPr>
         <w:lastRenderedPageBreak/>
-        <w:t xml:space="preserve">considerando tareas reales, contexto de uso y retroalimentación durante la construcción del prototipo </w:t>
-      </w:r>
-      <w:r>
-        <w:fldChar w:fldCharType="begin"/>
-      </w:r>
-      <w:r>
-        <w:instrText xml:space="preserve"> CITATION ISO2019 \l 3082 </w:instrText>
-      </w:r>
-      <w:r>
-        <w:fldChar w:fldCharType="separate"/>
-      </w:r>
-      <w:r>
-        <w:rPr>
-          <w:noProof/>
-        </w:rPr>
-        <w:t xml:space="preserve"> </w:t>
-      </w:r>
-      <w:r>
-        <w:rPr>
-          <w:noProof/>
-        </w:rPr>
-        <w:t>(ISO 9241-210:2019 Ergonomics of human-system interaction - Part 210: Human-centred design for interactive systems, 2019)</w:t>
-      </w:r>
-      <w:r>
-        <w:fldChar w:fldCharType="end"/>
-      </w:r>
-      <w:r>
-        <w:rPr>
-          <w:rFonts w:ascii="Times New Roman" w:hAnsi="Times New Roman"/>
-          <w:color w:val="000000"/>
-          <w:sz w:val="24"/>
-        </w:rPr>
-        <w:t>. La navegación deberá mantener términos consistentes y separar claramente acciones de consulta, edición, carga de documentos y análisis mediante inteligencia artificial.</w:t>
-      </w:r>
-    </w:p>
-    <w:p>
-      <w:r>
-        <w:rPr>
-          <w:rFonts w:ascii="Times New Roman" w:hAnsi="Times New Roman"/>
-          <w:sz w:val="24"/>
-        </w:rPr>
-        <w:t xml:space="preserve">La interfaz utilizará formularios progresivos, mensajes de validación comprensibles, filtros visibles y una línea de tiempo que reduzca la cantidad de pasos necesarios para recuperar antecedentes. Las salidas de inteligencia artificial se diferenciarán visualmente de los datos registrados por el usuario, indicando fecha de generación, información de origen y advertencia de carácter no diagnóstico. Los prototipos creados en Figma se utilizarán para revisar estas decisiones antes de implementar las pantallas definitivas </w:t>
-      </w:r>
-      <w:r>
-        <w:fldChar w:fldCharType="begin"/>
-      </w:r>
-      <w:r>
-        <w:instrText xml:space="preserve"> CITATION Figma2026 \l 3082 </w:instrText>
-      </w:r>
-      <w:r>
-        <w:fldChar w:fldCharType="separate"/>
-      </w:r>
-      <w:r>
-        <w:rPr>
-          <w:noProof/>
-        </w:rPr>
-        <w:t xml:space="preserve"> </w:t>
-      </w:r>
-      <w:r>
-        <w:rPr>
-          <w:noProof/>
-        </w:rPr>
-        <w:t>(Figma Design documentation, 2026)</w:t>
-      </w:r>
-      <w:r>
-        <w:fldChar w:fldCharType="end"/>
-      </w:r>
-      <w:r>
-        <w:rPr>
-          <w:rFonts w:ascii="Times New Roman" w:hAnsi="Times New Roman"/>
-          <w:sz w:val="24"/>
-        </w:rPr>
-        <w:t>.</w:t>
-      </w:r>
-    </w:p>
-    <w:p>
-      <w:r>
-        <w:rPr>
-          <w:rFonts w:ascii="Times New Roman" w:hAnsi="Times New Roman"/>
-          <w:color w:val="000000"/>
-          <w:sz w:val="24"/>
-        </w:rPr>
-        <w:t>La accesibilidad se considerará desde el diseño mediante etiquetas accesibles, orden de foco coherente, contraste suficiente, tamaños legibles, áreas táctiles adecuadas y compatibilidad con lectores de pantalla. React Native proporciona propiedades y APIs específicas para exponer información de accesibilidad a las plataformas móviles (React Native Documentation, 2026). Como referencia complementaria se considerarán los principios de las Web Content Accessibility Guidelines 2.2, especialmente perceptibilidad, operabilidad, comprensibilidad y robustez (Web Content Accessibility Guidelines (WCAG) 2.2, 2023).</w:t>
+        <w:t>La accesibilidad se considerará desde el diseño mediante etiquetas accesibles, orden de foco coherente, contraste suficiente, tamaños legibles, áreas de interacción adecuadas y compatibilidad con tecnologías de asistencia. React Native y React Native Web permiten exponer información de accesibilidad en Android y en la interfaz web. Como referencia complementaria se considerarán los principios de las Web Content Accessibility Guidelines 2.2, especialmente perceptibilidad, operabilidad, comprensibilidad y robustez (React Native Documentation, 2026; React Native for Web Documentation, 2026; Web Content Accessibility Guidelines (WCAG) 2.2, 2023).</w:t>
       </w:r>
     </w:p>
     <w:p>
@@ -4397,7 +4205,7 @@
           <w:color w:val="000000"/>
           <w:sz w:val="24"/>
         </w:rPr>
-        <w:t>La aplicación se diseñará para ejecutarse en dispositivos Android y iOS compatibles con React Native, adaptándose a distintos tamaños de pantalla y condiciones de conectividad. Las pruebas de rendimiento observarán escenarios representativos del prototipo académico, incluyendo tiempos de respuesta de la API, carga de listados y manejo de archivos, sin presentarse como certificación de capacidad masiva. Las revisiones de accesibilidad se integrarán a las pruebas de interfaz móvil y se contrastarán con criterios seleccionados de accesibilidad aplicables al proyecto.</w:t>
+        <w:t>La aplicación se diseñará para ejecutarse como aplicación Android y como versión web accesible desde navegadores modernos, adaptándose a diferentes tamaños de pantalla y condiciones de conectividad. Las pruebas de rendimiento observarán escenarios representativos del prototipo académico en ambas plataformas, incluyendo tiempos de respuesta de la API, carga de listados y manejo de archivos, sin presentarse como certificación de capacidad masiva. Las revisiones de accesibilidad se integrarán a las pruebas de las interfaces Android y web y se contrastarán con criterios seleccionados de accesibilidad aplicables al proyecto.</w:t>
       </w:r>
     </w:p>
     <w:p>
@@ -4609,15 +4417,7 @@
           <w:rFonts w:ascii="Times New Roman" w:hAnsi="Times New Roman"/>
           <w:sz w:val="24"/>
         </w:rPr>
-        <w:t xml:space="preserve">La retroalimentación combinará resultados estructurados y comentarios abiertos. Después de las pruebas se registrarán dificultades, errores, pasos innecesarios, términos poco claros y observaciones sobre la claridad de los límites de la inteligencia artificial. Los hallazgos se </w:t>
-      </w:r>
-      <w:r>
-        <w:rPr>
-          <w:rFonts w:ascii="Times New Roman" w:hAnsi="Times New Roman"/>
-          <w:sz w:val="24"/>
-        </w:rPr>
-        <w:lastRenderedPageBreak/>
-        <w:t>priorizarán según impacto y frecuencia, y las correcciones se incorporarán al tablero de trabajo para mantener trazabilidad entre observación, cambio implementado y nueva verificación.</w:t>
+        <w:t>La retroalimentación combinará resultados estructurados y comentarios abiertos. Después de las pruebas se registrarán dificultades, errores, pasos innecesarios, términos poco claros y observaciones sobre la claridad de los límites de la inteligencia artificial. Los hallazgos se priorizarán según impacto y frecuencia, y las correcciones se incorporarán al tablero de trabajo para mantener trazabilidad entre observación, cambio implementado y nueva verificación.</w:t>
       </w:r>
     </w:p>
     <w:p>
@@ -4626,6 +4426,7 @@
         <w:jc w:val="left"/>
       </w:pPr>
       <w:r>
+        <w:lastRenderedPageBreak/>
         <w:t>7 METODOLOGÍA</w:t>
       </w:r>
     </w:p>
@@ -4750,16 +4551,7 @@
           <w:color w:val="000000"/>
           <w:sz w:val="24"/>
         </w:rPr>
-        <w:t xml:space="preserve">También tendrá un alcance descriptivo, ya que se documentará cómo los participantes administran actualmente su información médica, qué dificultades encuentran y qué funciones </w:t>
-      </w:r>
-      <w:r>
-        <w:rPr>
-          <w:rFonts w:ascii="Times New Roman" w:hAnsi="Times New Roman"/>
-          <w:color w:val="000000"/>
-          <w:sz w:val="24"/>
-        </w:rPr>
-        <w:lastRenderedPageBreak/>
-        <w:t>consideran relevantes. Después de la implementación se describirá la experiencia de uso y la percepción sobre utilidad, claridad y confianza. La investigación no intentará atribuir mejoras clínicas al prototipo ni generalizar conclusiones más allá de las condiciones definidas para la muestra.</w:t>
+        <w:t>También tendrá un alcance descriptivo, ya que se documentará cómo los participantes administran actualmente su información médica, qué dificultades encuentran y qué funciones consideran relevantes. Después de la implementación se describirá la experiencia de uso y la percepción sobre utilidad, claridad y confianza. La investigación no intentará atribuir mejoras clínicas al prototipo ni generalizar conclusiones más allá de las condiciones definidas para la muestra.</w:t>
       </w:r>
     </w:p>
     <w:p>
@@ -4769,6 +4561,7 @@
         <w:jc w:val="left"/>
       </w:pPr>
       <w:r>
+        <w:lastRenderedPageBreak/>
         <w:t>7.3 MÉTODO DE INVESTIGACIÓN</w:t>
       </w:r>
     </w:p>
@@ -4905,16 +4698,7 @@
           <w:color w:val="000000"/>
           <w:sz w:val="24"/>
         </w:rPr>
-        <w:t xml:space="preserve">Las entrevistas semiestructuradas se dirigirán a profesionales de salud para conocer qué antecedentes suelen ser útiles durante una consulta, qué problemas produce la falta de información y qué límites debería respetar una herramienta basada en inteligencia artificial. La observación directa se empleará durante las pruebas del prototipo para registrar dificultades de </w:t>
-      </w:r>
-      <w:r>
-        <w:rPr>
-          <w:rFonts w:ascii="Times New Roman" w:hAnsi="Times New Roman"/>
-          <w:color w:val="000000"/>
-          <w:sz w:val="24"/>
-        </w:rPr>
-        <w:lastRenderedPageBreak/>
-        <w:t>navegación, errores y pasos innecesarios, evitando inferir estados clínicos o emocionales de los participantes.</w:t>
+        <w:t>Las entrevistas semiestructuradas se dirigirán a profesionales de salud para conocer qué antecedentes suelen ser útiles durante una consulta, qué problemas produce la falta de información y qué límites debería respetar una herramienta basada en inteligencia artificial. La observación directa se empleará durante las pruebas del prototipo para registrar dificultades de navegación, errores y pasos innecesarios, evitando inferir estados clínicos o emocionales de los participantes.</w:t>
       </w:r>
     </w:p>
     <w:p>
@@ -4933,7 +4717,15 @@
           <w:rFonts w:ascii="Times New Roman" w:hAnsi="Times New Roman"/>
           <w:sz w:val="24"/>
         </w:rPr>
-        <w:t>La recolección de información se organizará en instrumentos diferenciados para el diagnóstico inicial y la evaluación del prototipo. El diagnóstico inicial permitirá identificar necesidades y hábitos de los usuarios potenciales; la evaluación final medirá la ejecución de tareas, la usabilidad y la comprensión de los límites de la inteligencia artificial. No se utilizarán los resultados para establecer eficacia clínica ni para validar decisiones médicas.</w:t>
+        <w:t xml:space="preserve">La recolección de información se organizará en instrumentos diferenciados para el diagnóstico inicial y la evaluación del prototipo. El diagnóstico inicial permitirá identificar necesidades y hábitos de los usuarios potenciales; la evaluación final medirá la ejecución de tareas, la </w:t>
+      </w:r>
+      <w:r>
+        <w:rPr>
+          <w:rFonts w:ascii="Times New Roman" w:hAnsi="Times New Roman"/>
+          <w:sz w:val="24"/>
+        </w:rPr>
+        <w:lastRenderedPageBreak/>
+        <w:t>usabilidad y la comprensión de los límites de la inteligencia artificial. No se utilizarán los resultados para establecer eficacia clínica ni para validar decisiones médicas.</w:t>
       </w:r>
     </w:p>
     <w:p>
@@ -5324,7 +5116,6 @@
               <w:rPr>
                 <w:sz w:val="18"/>
               </w:rPr>
-              <w:lastRenderedPageBreak/>
               <w:t>Evaluación</w:t>
             </w:r>
           </w:p>
@@ -5547,6 +5338,7 @@
           <w:color w:val="000000"/>
           <w:sz w:val="24"/>
         </w:rPr>
+        <w:lastRenderedPageBreak/>
         <w:t>En una primera fase se realizará la revisión bibliográfica, delimitación final del problema, diseño de instrumentos y levantamiento diagnóstico. Los resultados se utilizarán para ajustar requerimientos, lenguaje de la interfaz y prioridades del backlog. En paralelo se elaborarán prototipos de navegación en Figma para revisar la secuencia de registro, consulta, carga de documentos y visualización de alertas antes de avanzar a la implementación completa.</w:t>
       </w:r>
     </w:p>
@@ -5577,15 +5369,18 @@
       <w:r>
         <w:t>7.5 HERRAMIENTAS DE INFORMACIÓN</w:t>
       </w:r>
-    </w:p>
-    <w:p>
-      <w:r>
-        <w:rPr>
-          <w:rFonts w:ascii="Times New Roman" w:hAnsi="Times New Roman"/>
-          <w:color w:val="000000"/>
-          <w:sz w:val="24"/>
-        </w:rPr>
-        <w:t>Figma se empleará para diseñar prototipos de interfaz, flujos de navegación y componentes visuales antes de implementar pantallas completas. Su uso permitirá validar de forma temprana la organización de formularios, la jerarquía de información y la secuencia de tareas del usuario (Figma Design documentation, 2026). Los prototipos funcionarán como apoyo para la evaluación de experiencia de usuario y como referencia durante la construcción de las pantallas móviles en React Native.</w:t>
+      <w:r>
+        <w:t xml:space="preserve"> {herramientas para agarrar datos tipo forms}</w:t>
+      </w:r>
+    </w:p>
+    <w:p>
+      <w:r>
+        <w:rPr>
+          <w:rFonts w:ascii="Times New Roman" w:hAnsi="Times New Roman"/>
+          <w:color w:val="000000"/>
+          <w:sz w:val="24"/>
+        </w:rPr>
+        <w:t>Figma se empleará para diseñar prototipos de interfaz, flujos de navegación y componentes visuales antes de implementar pantallas completas. Su uso permitirá validar de forma temprana la organización de formularios, la jerarquía de información y la secuencia de tareas del usuario (Figma Design documentation, 2026). Los prototipos funcionarán como apoyo para la evaluación de experiencia de usuario y como referencia durante la construcción de las interfaces Android y web con React Native y React Native Web.</w:t>
       </w:r>
     </w:p>
     <w:p>
@@ -5635,6 +5430,7 @@
         <w:pStyle w:val="Heading2"/>
       </w:pPr>
       <w:r>
+        <w:lastRenderedPageBreak/>
         <w:t>7.6 FUENTES DE INFORMACIÓN</w:t>
       </w:r>
     </w:p>
@@ -5656,7 +5452,48 @@
           <w:rFonts w:ascii="Times New Roman" w:hAnsi="Times New Roman"/>
           <w:sz w:val="24"/>
         </w:rPr>
-        <w:t xml:space="preserve">La población del estudio estará conformada por dos grupos diferenciados. El primer grupo estará integrado por usuarios potenciales: personas mayores de 18 años que gestionen información relacionada con su propia salud o con la salud de un familiar o dependiente. El segundo grupo estará integrado por profesionales de salud con experiencia en atención sanitaria y/o gestión de </w:t>
+        <w:t>La población del estudio estará conformada por dos grupos diferenciados. El primer grupo estará integrado por usuarios potenciales: personas mayores de 18 años que gestionen información relacionada con su propia salud o con la salud de un familiar o dependiente. El segundo grupo estará integrado por profesionales de salud con experiencia en atención sanitaria y/o gestión de información clínica. La evaluación tendrá carácter exploratorio y sus resultados no pretenderán representar estadísticamente a la población del departamento de Cochabamba.</w:t>
+      </w:r>
+    </w:p>
+    <w:p>
+      <w:r>
+        <w:rPr>
+          <w:rFonts w:ascii="Times New Roman" w:hAnsi="Times New Roman"/>
+          <w:sz w:val="24"/>
+        </w:rPr>
+        <w:t>Para usuarios potenciales se realizará una evaluación exploratoria con un mínimo de 20 participantes, seleccionados mediante muestreo no probabilístico por conveniencia. Este tamaño responde a los objetivos de usabilidad y percepción de utilidad del prototipo; los resultados serán analizados de forma descriptiva.</w:t>
+      </w:r>
+    </w:p>
+    <w:p>
+      <w:r>
+        <w:rPr>
+          <w:rFonts w:ascii="Times New Roman" w:hAnsi="Times New Roman"/>
+          <w:sz w:val="24"/>
+        </w:rPr>
+        <w:t>Para profesionales de salud se seleccionarán entre 5 y 8 participantes mediante muestreo no probabilístico intencional, considerando su experiencia y pertinencia respecto al manejo de información clínica. Su participación tendrá como finalidad obtener una valoración cualitativa de las funcionalidades y de los límites del sistema desde una perspectiva profesional.</w:t>
+      </w:r>
+    </w:p>
+    <w:p>
+      <w:pPr>
+        <w:rPr>
+          <w:color w:val="000000"/>
+        </w:rPr>
+      </w:pPr>
+      <w:r>
+        <w:rPr>
+          <w:rFonts w:ascii="Times New Roman" w:hAnsi="Times New Roman"/>
+          <w:sz w:val="24"/>
+        </w:rPr>
+        <w:t>Para usuarios potenciales se considerarán como criterios de inclusión: tener 18 años o más, gestionar información relacionada con su propia salud o con la de un familiar o dependiente, contar con un dispositivo con conexión a Internet y aceptar voluntariamente participar mediante consentimiento informado. Para profesionales de salud se requerirá ser mayor de 18 años, ejercer o contar con experiencia en atención sanitaria y/o gestión de información clínica, y aceptar voluntariamente participar. Se excluirá a quienes no cumplan los criterios de inclusión o decidan retirarse del estudio en cualquier momento.</w:t>
+      </w:r>
+    </w:p>
+    <w:p>
+      <w:r>
+        <w:rPr>
+          <w:rFonts w:ascii="Times New Roman" w:hAnsi="Times New Roman"/>
+          <w:sz w:val="24"/>
+        </w:rPr>
+        <w:t xml:space="preserve">Las fuentes primarias serán los usuarios potenciales y los profesionales de salud que participen en las encuestas, entrevistas, pruebas de tareas, cuestionario SUS y revisión cualitativa del prototipo. Las fuentes secundarias comprenderán libros, artículos científicos, normas, estándares, documentación técnica oficial y publicaciones institucionales utilizadas para sustentar el problema, el diseño, la seguridad, la accesibilidad y el uso responsable de inteligencia artificial. La información médica de los participantes no se empleará como fuente </w:t>
       </w:r>
       <w:r>
         <w:rPr>
@@ -5664,48 +5501,7 @@
           <w:sz w:val="24"/>
         </w:rPr>
         <w:lastRenderedPageBreak/>
-        <w:t>información clínica. La evaluación tendrá carácter exploratorio y sus resultados no pretenderán representar estadísticamente a la población del departamento de Cochabamba.</w:t>
-      </w:r>
-    </w:p>
-    <w:p>
-      <w:r>
-        <w:rPr>
-          <w:rFonts w:ascii="Times New Roman" w:hAnsi="Times New Roman"/>
-          <w:sz w:val="24"/>
-        </w:rPr>
-        <w:t>Para usuarios potenciales se realizará una evaluación exploratoria con un mínimo de 20 participantes, seleccionados mediante muestreo no probabilístico por conveniencia. Este tamaño responde a los objetivos de usabilidad y percepción de utilidad del prototipo; los resultados serán analizados de forma descriptiva.</w:t>
-      </w:r>
-    </w:p>
-    <w:p>
-      <w:r>
-        <w:rPr>
-          <w:rFonts w:ascii="Times New Roman" w:hAnsi="Times New Roman"/>
-          <w:sz w:val="24"/>
-        </w:rPr>
-        <w:t>Para profesionales de salud se seleccionarán entre 5 y 8 participantes mediante muestreo no probabilístico intencional, considerando su experiencia y pertinencia respecto al manejo de información clínica. Su participación tendrá como finalidad obtener una valoración cualitativa de las funcionalidades y de los límites del sistema desde una perspectiva profesional.</w:t>
-      </w:r>
-    </w:p>
-    <w:p>
-      <w:pPr>
-        <w:rPr>
-          <w:color w:val="000000"/>
-        </w:rPr>
-      </w:pPr>
-      <w:r>
-        <w:rPr>
-          <w:rFonts w:ascii="Times New Roman" w:hAnsi="Times New Roman"/>
-          <w:sz w:val="24"/>
-        </w:rPr>
-        <w:t>Para usuarios potenciales se considerarán como criterios de inclusión: tener 18 años o más, gestionar información relacionada con su propia salud o con la de un familiar o dependiente, contar con un dispositivo con conexión a Internet y aceptar voluntariamente participar mediante consentimiento informado. Para profesionales de salud se requerirá ser mayor de 18 años, ejercer o contar con experiencia en atención sanitaria y/o gestión de información clínica, y aceptar voluntariamente participar. Se excluirá a quienes no cumplan los criterios de inclusión o decidan retirarse del estudio en cualquier momento.</w:t>
-      </w:r>
-    </w:p>
-    <w:p>
-      <w:r>
-        <w:rPr>
-          <w:rFonts w:ascii="Times New Roman" w:hAnsi="Times New Roman"/>
-          <w:sz w:val="24"/>
-        </w:rPr>
-        <w:t>Las fuentes primarias serán los usuarios potenciales y los profesionales de salud que participen en las encuestas, entrevistas, pruebas de tareas, cuestionario SUS y revisión cualitativa del prototipo. Las fuentes secundarias comprenderán libros, artículos científicos, normas, estándares, documentación técnica oficial y publicaciones institucionales utilizadas para sustentar el problema, el diseño, la seguridad, la accesibilidad y el uso responsable de inteligencia artificial. La información médica de los participantes no se empleará como fuente de investigación; las demostraciones y pruebas se realizarán prioritariamente con datos ficticios o sintéticos.</w:t>
+        <w:t>de investigación; las demostraciones y pruebas se realizarán prioritariamente con datos ficticios o sintéticos.</w:t>
       </w:r>
     </w:p>
     <w:p>
@@ -5792,7 +5588,6 @@
           <w:color w:val="000000"/>
           <w:sz w:val="24"/>
         </w:rPr>
-        <w:lastRenderedPageBreak/>
         <w:t>MARCO TEÓRICO Y CONCEPTUAL</w:t>
       </w:r>
     </w:p>
@@ -6462,6 +6257,7 @@
           <w:color w:val="000000"/>
           <w:sz w:val="24"/>
         </w:rPr>
+        <w:lastRenderedPageBreak/>
         <w:t>1.6. MARCO DE EVALUACIÓN</w:t>
       </w:r>
     </w:p>
@@ -6621,7 +6417,6 @@
           <w:color w:val="000000"/>
           <w:sz w:val="24"/>
         </w:rPr>
-        <w:lastRenderedPageBreak/>
         <w:t>2.1.1. REQUERIMIENTOS FUNCIONALES</w:t>
       </w:r>
     </w:p>
@@ -6889,7 +6684,7 @@
           <w:color w:val="000000"/>
           <w:sz w:val="24"/>
         </w:rPr>
-        <w:t>2.4.1. IMPLEMENTACIÓN DE LA APLICACIÓN EN REACT NATIVE</w:t>
+        <w:t>2.4.1. IMPLEMENTACIÓN DE LA INTERFAZ MULTIPLATAFORMA EN REACT NATIVE Y REACT NATIVE WEB</w:t>
       </w:r>
     </w:p>
     <w:p>
@@ -7262,6 +7057,7 @@
           <w:color w:val="000000"/>
           <w:sz w:val="24"/>
         </w:rPr>
+        <w:lastRenderedPageBreak/>
         <w:t>3.3. EVALUACIÓN DEL MÓDULO DE INTELIGENCIA ARTIFICIAL</w:t>
       </w:r>
     </w:p>
@@ -7446,7 +7242,6 @@
           <w:color w:val="000000"/>
           <w:sz w:val="24"/>
         </w:rPr>
-        <w:lastRenderedPageBreak/>
         <w:t>4.3. CRONOGRAMA DE ACTIVIDADES</w:t>
       </w:r>
     </w:p>
@@ -8181,7 +7976,14 @@
               <w:rPr>
                 <w:sz w:val="18"/>
               </w:rPr>
-              <w:t>Integración y pruebas de la funcionalidad de IA</w:t>
+              <w:t xml:space="preserve">Integración y pruebas de la </w:t>
+            </w:r>
+            <w:r>
+              <w:rPr>
+                <w:sz w:val="18"/>
+              </w:rPr>
+              <w:lastRenderedPageBreak/>
+              <w:t>funcionalidad de IA</w:t>
             </w:r>
           </w:p>
         </w:tc>
@@ -8456,6 +8258,9 @@
         </w:rPr>
       </w:pPr>
       <w:r>
+        <w:rPr>
+          <w:lang w:val="en-US"/>
+        </w:rPr>
         <w:t>About GitHub and Git. (2026). Obtenido de https://docs.github.com/en/get-started/start-your-journey/about-github-and-git</w:t>
       </w:r>
     </w:p>
@@ -8518,7 +8323,6 @@
         <w:ind w:left="720" w:hanging="720"/>
         <w:rPr>
           <w:noProof/>
-          <w:lang w:val="en-US"/>
         </w:rPr>
       </w:pPr>
       <w:r>
@@ -8526,7 +8330,13 @@
           <w:noProof/>
           <w:lang w:val="en-US"/>
         </w:rPr>
-        <w:t>Chacon, S., &amp; Straub, B. (2014). Pro Git (2 ed.). Apress. Obtenido de https://git-scm.com/book/en/v2</w:t>
+        <w:t xml:space="preserve">Chacon, S., &amp; Straub, B. (2014). Pro Git (2 ed.). Apress. </w:t>
+      </w:r>
+      <w:r>
+        <w:rPr>
+          <w:noProof/>
+        </w:rPr>
+        <w:t>Obtenido de https://git-scm.com/book/en/v2</w:t>
       </w:r>
     </w:p>
     <w:p>
@@ -8541,9 +8351,84 @@
       <w:r>
         <w:rPr>
           <w:noProof/>
+        </w:rPr>
+        <w:t>DeepSeek API Docs. (2026). Obtenido de https://api-docs.deepseek.com/</w:t>
+      </w:r>
+    </w:p>
+    <w:p>
+      <w:pPr>
+        <w:pStyle w:val="Bibliography"/>
+        <w:ind w:left="720" w:hanging="720"/>
+        <w:rPr>
+          <w:noProof/>
           <w:lang w:val="en-US"/>
         </w:rPr>
-        <w:t>DeepSeek API Docs. (2026). Obtenido de https://api-docs.deepseek.com/</w:t>
+      </w:pPr>
+      <w:r>
+        <w:rPr>
+          <w:i/>
+          <w:iCs/>
+          <w:noProof/>
+          <w:lang w:val="en-US"/>
+        </w:rPr>
+        <w:t>Ethical considerations and data protection principles for digital personal health records. (2022). Obtenido de https://smart.who.int/trust/</w:t>
+      </w:r>
+    </w:p>
+    <w:p>
+      <w:pPr>
+        <w:pStyle w:val="Bibliography"/>
+        <w:ind w:left="720" w:hanging="720"/>
+        <w:rPr>
+          <w:noProof/>
+          <w:lang w:val="en-US"/>
+        </w:rPr>
+      </w:pPr>
+      <w:r>
+        <w:rPr>
+          <w:i/>
+          <w:iCs/>
+          <w:noProof/>
+          <w:lang w:val="en-US"/>
+        </w:rPr>
+        <w:t>(2025). Ethics and governance of artificial intelligence for health: Guidance on large multi-modal models. Obtenido de https://www.who.int/publications/i/item/9789240084759</w:t>
+      </w:r>
+    </w:p>
+    <w:p>
+      <w:pPr>
+        <w:pStyle w:val="Bibliography"/>
+        <w:ind w:left="720" w:hanging="720"/>
+        <w:rPr>
+          <w:noProof/>
+        </w:rPr>
+      </w:pPr>
+      <w:r>
+        <w:rPr>
+          <w:noProof/>
+          <w:lang w:val="en-US"/>
+        </w:rPr>
+        <w:t xml:space="preserve">(2021). Ethics and governance of artificial intelligence for health: WHO guidance. </w:t>
+      </w:r>
+      <w:r>
+        <w:rPr>
+          <w:noProof/>
+        </w:rPr>
+        <w:t>Obtenido de https://www.who.int/publications/i/item/9789240029200</w:t>
+      </w:r>
+    </w:p>
+    <w:p>
+      <w:pPr>
+        <w:pStyle w:val="Bibliography"/>
+        <w:ind w:left="720" w:hanging="720"/>
+        <w:rPr>
+          <w:noProof/>
+          <w:lang w:val="es-ES"/>
+        </w:rPr>
+      </w:pPr>
+      <w:r>
+        <w:rPr>
+          <w:noProof/>
+        </w:rPr>
+        <w:t>Express.js Documentation. (2026). Obtenido de https://expressjs.com/</w:t>
       </w:r>
     </w:p>
     <w:p>
@@ -8562,7 +8447,85 @@
           <w:noProof/>
           <w:lang w:val="es-ES"/>
         </w:rPr>
-        <w:t>Ethical considerations and data protection principles for digital personal health records. (2022). Obtenido de https://smart.who.int/trust/</w:t>
+        <w:t>FHIR Release 5 (v5.0.0). (2023). Obtenido de https://hl7.org/fhir/</w:t>
+      </w:r>
+    </w:p>
+    <w:p>
+      <w:pPr>
+        <w:pStyle w:val="Bibliography"/>
+        <w:ind w:left="720" w:hanging="720"/>
+        <w:rPr>
+          <w:noProof/>
+          <w:lang w:val="es-ES"/>
+        </w:rPr>
+      </w:pPr>
+      <w:r>
+        <w:rPr>
+          <w:i/>
+          <w:iCs/>
+          <w:noProof/>
+          <w:lang w:val="es-ES"/>
+        </w:rPr>
+        <w:t>Figma Design documentation. (2026). Obtenido de https://help.figma.com/hc/en-us/categories/360002042553-Figma-Design</w:t>
+      </w:r>
+    </w:p>
+    <w:p>
+      <w:pPr>
+        <w:pStyle w:val="Bibliography"/>
+        <w:ind w:left="720" w:hanging="720"/>
+        <w:rPr>
+          <w:noProof/>
+          <w:lang w:val="en-US"/>
+        </w:rPr>
+      </w:pPr>
+      <w:r>
+        <w:rPr>
+          <w:noProof/>
+          <w:lang w:val="en-US"/>
+        </w:rPr>
+        <w:lastRenderedPageBreak/>
+        <w:t>Fink, A. (2019). Conducting research literature reviews: From the Internet to paper (5 ed.). SAGE Publications.</w:t>
+      </w:r>
+    </w:p>
+    <w:p>
+      <w:pPr>
+        <w:pStyle w:val="Bibliography"/>
+        <w:ind w:left="720" w:hanging="720"/>
+        <w:rPr>
+          <w:noProof/>
+          <w:lang w:val="en-US"/>
+        </w:rPr>
+      </w:pPr>
+      <w:r>
+        <w:rPr>
+          <w:noProof/>
+          <w:lang w:val="en-US"/>
+        </w:rPr>
+        <w:t>(2025). Global strategy on digital health 2020-2027. Obtenido de https://www.who.int/publications/i/item/9789240116870</w:t>
+      </w:r>
+    </w:p>
+    <w:p>
+      <w:pPr>
+        <w:pStyle w:val="Bibliography"/>
+        <w:ind w:left="720" w:hanging="720"/>
+        <w:rPr>
+          <w:noProof/>
+          <w:lang w:val="en-US"/>
+        </w:rPr>
+      </w:pPr>
+      <w:r>
+        <w:rPr>
+          <w:noProof/>
+          <w:lang w:val="es-ES"/>
+        </w:rPr>
+        <w:t xml:space="preserve">Hernández Sampieri, R., Fernández Collado, C., &amp; Baptista Lucio, M. (2014). </w:t>
+      </w:r>
+      <w:r>
+        <w:rPr>
+          <w:noProof/>
+          <w:lang w:val="en-US"/>
+        </w:rPr>
+        <w:t>Metodología de la investigación (6 ed.). McGraw-Hill.</w:t>
       </w:r>
     </w:p>
     <w:p>
@@ -8581,7 +8544,7 @@
           <w:noProof/>
           <w:lang w:val="en-US"/>
         </w:rPr>
-        <w:t>(2025). Ethics and governance of artificial intelligence for health: Guidance on large multi-modal models. Obtenido de https://www.who.int/publications/i/item/9789240084759</w:t>
+        <w:t xml:space="preserve">(2018). ISO 9241-11:2018 Ergonomics of human-system interaction - Part 11: Usability: Definitions and concepts. </w:t>
       </w:r>
     </w:p>
     <w:p>
@@ -8598,7 +8561,7 @@
           <w:noProof/>
           <w:lang w:val="en-US"/>
         </w:rPr>
-        <w:t>(2021). Ethics and governance of artificial intelligence for health: WHO guidance. Obtenido de https://www.who.int/publications/i/item/9789240029200</w:t>
+        <w:t xml:space="preserve">(2019). ISO 9241-210:2019 Ergonomics of human-system interaction - Part 210: Human-centred design for interactive systems. </w:t>
       </w:r>
     </w:p>
     <w:p>
@@ -8607,15 +8570,30 @@
         <w:ind w:left="720" w:hanging="720"/>
         <w:rPr>
           <w:noProof/>
+        </w:rPr>
+      </w:pPr>
+      <w:r>
+        <w:rPr>
+          <w:noProof/>
+        </w:rPr>
+        <w:t>Lozada, J. (2014). Investigación aplicada: Definición, propiedad intelectual e industria. 3(1), 34-39.</w:t>
+      </w:r>
+    </w:p>
+    <w:p>
+      <w:pPr>
+        <w:pStyle w:val="Bibliography"/>
+        <w:ind w:left="720" w:hanging="720"/>
+        <w:rPr>
+          <w:noProof/>
           <w:lang w:val="es-ES"/>
         </w:rPr>
       </w:pPr>
       <w:r>
         <w:rPr>
           <w:noProof/>
-          <w:lang w:val="en-US"/>
-        </w:rPr>
-        <w:t>Express.js Documentation. (2026). Obtenido de https://expressjs.com/</w:t>
+          <w:lang w:val="es-ES"/>
+        </w:rPr>
+        <w:t>MySQL Reference Manual. (2026). Obtenido de https://dev.mysql.com/doc/refman/en/</w:t>
       </w:r>
     </w:p>
     <w:p>
@@ -8634,7 +8612,66 @@
           <w:noProof/>
           <w:lang w:val="es-ES"/>
         </w:rPr>
-        <w:t>FHIR Release 5 (v5.0.0). (2023). Obtenido de https://hl7.org/fhir/</w:t>
+        <w:t>Node.js Documentation. (2026). Obtenido de https://nodejs.org/docs/latest/api/</w:t>
+      </w:r>
+    </w:p>
+    <w:p>
+      <w:pPr>
+        <w:pStyle w:val="Bibliography"/>
+        <w:ind w:left="720" w:hanging="720"/>
+        <w:rPr>
+          <w:noProof/>
+          <w:lang w:val="en-US"/>
+        </w:rPr>
+      </w:pPr>
+      <w:r>
+        <w:rPr>
+          <w:noProof/>
+          <w:lang w:val="en-US"/>
+        </w:rPr>
+        <w:t>Ohno, T. (1988). Toyota production system: Beyond large-scale production. Productivity Press.</w:t>
+      </w:r>
+    </w:p>
+    <w:p>
+      <w:pPr>
+        <w:pStyle w:val="Bibliography"/>
+        <w:ind w:left="720" w:hanging="720"/>
+        <w:rPr>
+          <w:noProof/>
+          <w:lang w:val="en-US"/>
+        </w:rPr>
+      </w:pPr>
+      <w:r>
+        <w:rPr>
+          <w:i/>
+          <w:iCs/>
+          <w:noProof/>
+          <w:lang w:val="en-US"/>
+        </w:rPr>
+        <w:t>OWASP Application Security Verification Standard (ASVS) 5.0.0. (2025). Obtenido de https://owasp.org/www-project-application-security-verification-standard/</w:t>
+      </w:r>
+    </w:p>
+    <w:p>
+      <w:pPr>
+        <w:pStyle w:val="Bibliography"/>
+        <w:ind w:left="720" w:hanging="720"/>
+        <w:rPr>
+          <w:noProof/>
+          <w:lang w:val="es-ES"/>
+        </w:rPr>
+      </w:pPr>
+      <w:r>
+        <w:rPr>
+          <w:noProof/>
+          <w:lang w:val="en-US"/>
+        </w:rPr>
+        <w:t xml:space="preserve">Ponto, J. (2015). Understanding and evaluating survey research. </w:t>
+      </w:r>
+      <w:r>
+        <w:rPr>
+          <w:noProof/>
+        </w:rPr>
+        <w:t>6(2), 168-171. Obtenido de https://pmc.ncbi.nlm.nih.gov/articles/PMC4601897/</w:t>
       </w:r>
     </w:p>
     <w:p>
@@ -8653,58 +8690,7 @@
           <w:noProof/>
           <w:lang w:val="es-ES"/>
         </w:rPr>
-        <w:t>Figma Design documentation. (2026). Obtenido de https://help.figma.com/hc/en-us/categories/360002042553-Figma-Design</w:t>
-      </w:r>
-    </w:p>
-    <w:p>
-      <w:pPr>
-        <w:pStyle w:val="Bibliography"/>
-        <w:ind w:left="720" w:hanging="720"/>
-        <w:rPr>
-          <w:noProof/>
-          <w:lang w:val="en-US"/>
-        </w:rPr>
-      </w:pPr>
-      <w:r>
-        <w:rPr>
-          <w:noProof/>
-          <w:lang w:val="en-US"/>
-        </w:rPr>
-        <w:t>Fink, A. (2019). Conducting research literature reviews: From the Internet to paper (5 ed.). SAGE Publications.</w:t>
-      </w:r>
-    </w:p>
-    <w:p>
-      <w:pPr>
-        <w:pStyle w:val="Bibliography"/>
-        <w:ind w:left="720" w:hanging="720"/>
-        <w:rPr>
-          <w:noProof/>
-          <w:lang w:val="en-US"/>
-        </w:rPr>
-      </w:pPr>
-      <w:r>
-        <w:rPr>
-          <w:noProof/>
-          <w:lang w:val="en-US"/>
-        </w:rPr>
-        <w:t>(2025). Global strategy on digital health 2020-2027. Obtenido de https://www.who.int/publications/i/item/9789240116870</w:t>
-      </w:r>
-    </w:p>
-    <w:p>
-      <w:pPr>
-        <w:pStyle w:val="Bibliography"/>
-        <w:ind w:left="720" w:hanging="720"/>
-        <w:rPr>
-          <w:noProof/>
-          <w:lang w:val="es-ES"/>
-        </w:rPr>
-      </w:pPr>
-      <w:r>
-        <w:rPr>
-          <w:noProof/>
-          <w:lang w:val="es-ES"/>
-        </w:rPr>
-        <w:t>Hernández Sampieri, R., Fernández Collado, C., &amp; Baptista Lucio, M. (2014). Metodología de la investigación (6 ed.). McGraw-Hill.</w:t>
+        <w:t>Postman Docs. (2026). Obtenido de https://learning.postman.com/docs/</w:t>
       </w:r>
     </w:p>
     <w:p>
@@ -8723,7 +8709,10 @@
           <w:noProof/>
           <w:lang w:val="es-ES"/>
         </w:rPr>
-        <w:t xml:space="preserve">(2018). ISO 9241-11:2018 Ergonomics of human-system interaction - Part 11: Usability: Definitions and concepts. </w:t>
+        <w:t>React Native Documentation. (2026). Obtenido de https://reactnative.dev/docs/getting-started</w:t>
+      </w:r>
+      <w:r>
+        <w:t xml:space="preserve"> React Native for Web Documentation. (2026). Obtenido de https://necolas.github.io/react-native-web/docs/</w:t>
       </w:r>
     </w:p>
     <w:p>
@@ -8732,7 +8721,7 @@
         <w:ind w:left="720" w:hanging="720"/>
         <w:rPr>
           <w:noProof/>
-          <w:lang w:val="en-US"/>
+          <w:lang w:val="es-ES"/>
         </w:rPr>
       </w:pPr>
       <w:r>
@@ -8740,41 +8729,7 @@
           <w:noProof/>
           <w:lang w:val="en-US"/>
         </w:rPr>
-        <w:t xml:space="preserve">(2019). ISO 9241-210:2019 Ergonomics of human-system interaction - Part 210: Human-centred design for interactive systems. </w:t>
-      </w:r>
-    </w:p>
-    <w:p>
-      <w:pPr>
-        <w:pStyle w:val="Bibliography"/>
-        <w:ind w:left="720" w:hanging="720"/>
-        <w:rPr>
-          <w:noProof/>
-          <w:lang w:val="en-US"/>
-        </w:rPr>
-      </w:pPr>
-      <w:r>
-        <w:rPr>
-          <w:noProof/>
-          <w:lang w:val="en-US"/>
-        </w:rPr>
-        <w:t>Lozada, J. (2014). Investigación aplicada: Definición, propiedad intelectual e industria. 3(1), 34-39.</w:t>
-      </w:r>
-    </w:p>
-    <w:p>
-      <w:pPr>
-        <w:pStyle w:val="Bibliography"/>
-        <w:ind w:left="720" w:hanging="720"/>
-        <w:rPr>
-          <w:noProof/>
-          <w:lang w:val="es-ES"/>
-        </w:rPr>
-      </w:pPr>
-      <w:r>
-        <w:rPr>
-          <w:noProof/>
-          <w:lang w:val="es-ES"/>
-        </w:rPr>
-        <w:t>MySQL Reference Manual. (2026). Obtenido de https://dev.mysql.com/doc/refman/en/</w:t>
+        <w:t>Tang, P. C., Ash, J. S., Bates, D. W., Overhage, J. M., &amp; Sands, D. Z. (2006). Personal health records: Definitions, benefits, and strategies for overcoming barriers to adoption. 13(2), 121-126.</w:t>
       </w:r>
     </w:p>
     <w:p>
@@ -8793,133 +8748,6 @@
           <w:noProof/>
           <w:lang w:val="es-ES"/>
         </w:rPr>
-        <w:t>Node.js Documentation. (2026). Obtenido de https://nodejs.org/docs/latest/api/</w:t>
-      </w:r>
-    </w:p>
-    <w:p>
-      <w:pPr>
-        <w:pStyle w:val="Bibliography"/>
-        <w:ind w:left="720" w:hanging="720"/>
-        <w:rPr>
-          <w:noProof/>
-          <w:lang w:val="en-US"/>
-        </w:rPr>
-      </w:pPr>
-      <w:r>
-        <w:rPr>
-          <w:noProof/>
-          <w:lang w:val="en-US"/>
-        </w:rPr>
-        <w:t>Ohno, T. (1988). Toyota production system: Beyond large-scale production. Productivity Press.</w:t>
-      </w:r>
-    </w:p>
-    <w:p>
-      <w:pPr>
-        <w:pStyle w:val="Bibliography"/>
-        <w:ind w:left="720" w:hanging="720"/>
-        <w:rPr>
-          <w:noProof/>
-          <w:lang w:val="en-US"/>
-        </w:rPr>
-      </w:pPr>
-      <w:r>
-        <w:rPr>
-          <w:i/>
-          <w:iCs/>
-          <w:noProof/>
-          <w:lang w:val="en-US"/>
-        </w:rPr>
-        <w:t>OWASP Application Security Verification Standard (ASVS) 5.0.0. (2025). Obtenido de https://owasp.org/www-project-application-security-verification-standard/</w:t>
-      </w:r>
-    </w:p>
-    <w:p>
-      <w:pPr>
-        <w:pStyle w:val="Bibliography"/>
-        <w:ind w:left="720" w:hanging="720"/>
-        <w:rPr>
-          <w:noProof/>
-          <w:lang w:val="es-ES"/>
-        </w:rPr>
-      </w:pPr>
-      <w:r>
-        <w:rPr>
-          <w:noProof/>
-          <w:lang w:val="en-US"/>
-        </w:rPr>
-        <w:t>Ponto, J. (2015). Understanding and evaluating survey research. 6(2), 168-171. Obtenido de https://pmc.ncbi.nlm.nih.gov/articles/PMC4601897/</w:t>
-      </w:r>
-    </w:p>
-    <w:p>
-      <w:pPr>
-        <w:pStyle w:val="Bibliography"/>
-        <w:ind w:left="720" w:hanging="720"/>
-        <w:rPr>
-          <w:noProof/>
-          <w:lang w:val="es-ES"/>
-        </w:rPr>
-      </w:pPr>
-      <w:r>
-        <w:rPr>
-          <w:i/>
-          <w:iCs/>
-          <w:noProof/>
-          <w:lang w:val="es-ES"/>
-        </w:rPr>
-        <w:t>Postman Docs. (2026). Obtenido de https://learning.postman.com/docs/</w:t>
-      </w:r>
-    </w:p>
-    <w:p>
-      <w:pPr>
-        <w:pStyle w:val="Bibliography"/>
-        <w:ind w:left="720" w:hanging="720"/>
-        <w:rPr>
-          <w:noProof/>
-          <w:lang w:val="es-ES"/>
-        </w:rPr>
-      </w:pPr>
-      <w:r>
-        <w:rPr>
-          <w:i/>
-          <w:iCs/>
-          <w:noProof/>
-          <w:lang w:val="en-US"/>
-        </w:rPr>
-        <w:t>React Native Documentation. (2026). Obtenido de https://reactnative.dev/docs/getting-started</w:t>
-      </w:r>
-    </w:p>
-    <w:p>
-      <w:pPr>
-        <w:pStyle w:val="Bibliography"/>
-        <w:ind w:left="720" w:hanging="720"/>
-        <w:rPr>
-          <w:noProof/>
-          <w:lang w:val="es-ES"/>
-        </w:rPr>
-      </w:pPr>
-      <w:r>
-        <w:rPr>
-          <w:noProof/>
-          <w:lang w:val="en-US"/>
-        </w:rPr>
-        <w:t>Tang, P. C., Ash, J. S., Bates, D. W., Overhage, J. M., &amp; Sands, D. Z. (2006). Personal health records: Definitions, benefits, and strategies for overcoming barriers to adoption. 13(2), 121-126.</w:t>
-      </w:r>
-    </w:p>
-    <w:p>
-      <w:pPr>
-        <w:pStyle w:val="Bibliography"/>
-        <w:ind w:left="720" w:hanging="720"/>
-        <w:rPr>
-          <w:noProof/>
-          <w:lang w:val="es-ES"/>
-        </w:rPr>
-      </w:pPr>
-      <w:r>
-        <w:rPr>
-          <w:i/>
-          <w:iCs/>
-          <w:noProof/>
-          <w:lang w:val="es-ES"/>
-        </w:rPr>
         <w:t>Web Content Accessibility Guidelines (WCAG) 2.2. (2023). Obtenido de https://www.w3.org/TR/WCAG22/</w:t>
       </w:r>
     </w:p>
@@ -8932,9 +8760,6 @@
           <w:lang w:val="en-US"/>
         </w:rPr>
       </w:pPr>
-      <w:r>
-        <w:fldChar w:fldCharType="end"/>
-      </w:r>
     </w:p>
     <w:sectPr>
       <w:headerReference w:type="default" r:id="rId17"/>
@@ -9024,7 +8849,7 @@
       </w:r>
     </w:p>
   </w:comment>
-  <w:comment w:id="4" w:author="Magaly Gomez Ugarte" w:date="2026-08-15T16:48:00Z" w:initials="MG">
+  <w:comment w:id="5" w:author="Magaly Gomez Ugarte" w:date="2026-08-15T17:07:00Z" w:initials="MG">
     <w:p>
       <w:pPr>
         <w:pStyle w:val="CommentText"/>
@@ -9037,11 +8862,14 @@
         <w:annotationRef/>
       </w:r>
       <w:r>
-        <w:t>tercera edad y otros</w:t>
+        <w:rPr>
+          <w:color w:val="000000"/>
+        </w:rPr>
+        <w:t>Prestador?...se sugiere cambiar por otro término más claro y preciso.</w:t>
       </w:r>
     </w:p>
   </w:comment>
-  <w:comment w:id="5" w:author="David Acha" w:date="2026-08-21T01:00:00Z" w:initials="DA">
+  <w:comment w:id="6" w:author="David Acha" w:date="2026-08-21T01:03:00Z" w:initials="DA">
     <w:p>
       <w:pPr>
         <w:pStyle w:val="CommentText"/>
@@ -9058,7 +8886,20 @@
       </w:r>
     </w:p>
   </w:comment>
-  <w:comment w:id="8" w:author="Magaly Gomez Ugarte" w:date="2026-08-15T17:07:00Z" w:initials="MG">
+  <w:comment w:id="8" w:author="David Acha" w:date="2026-08-21T05:18:00Z" w:initials="">
+    <w:p>
+      <w:r>
+        <w:rPr>
+          <w:rStyle w:val="CommentReference"/>
+        </w:rPr>
+        <w:annotationRef/>
+      </w:r>
+      <w:r>
+        <w:t>Corregido — David Acha</w:t>
+      </w:r>
+    </w:p>
+  </w:comment>
+  <w:comment w:id="9" w:author="David Acha" w:date="2026-08-21T01:25:00Z" w:initials="DA">
     <w:p>
       <w:pPr>
         <w:pStyle w:val="CommentText"/>
@@ -9071,96 +8912,33 @@
         <w:annotationRef/>
       </w:r>
       <w:r>
-        <w:rPr>
-          <w:color w:val="000000"/>
-        </w:rPr>
-        <w:t>Prestador?...se sugiere cambiar por otro término más claro y preciso.</w:t>
-      </w:r>
-    </w:p>
-  </w:comment>
-  <w:comment w:id="9" w:author="David Acha" w:date="2026-08-21T01:03:00Z" w:initials="DA">
+        <w:t>“ORIGINAL”</w:t>
+      </w:r>
+      <w:r>
+        <w:br/>
+        <w:t>Sugerencia: La viabilidad no partirá del supuesto de una prestación permanente de servicios sin costo, sino de la estimación de los recursos necesarios para el prototipo y documentar cómo evolucionarían los costos ante un incremento en el número de usuarios.</w:t>
+      </w:r>
+    </w:p>
     <w:p>
       <w:pPr>
         <w:pStyle w:val="CommentText"/>
         <w:jc w:val="left"/>
       </w:pPr>
       <w:r>
-        <w:rPr>
-          <w:rStyle w:val="CommentReference"/>
-        </w:rPr>
-        <w:annotationRef/>
-      </w:r>
-      <w:r>
-        <w:t>Corregido</w:t>
-      </w:r>
-    </w:p>
-  </w:comment>
-  <w:comment w:id="15" w:author="David Acha" w:date="2026-08-21T05:18:00Z" w:initials="">
-    <w:p>
-      <w:r>
-        <w:rPr>
-          <w:rStyle w:val="CommentReference"/>
-        </w:rPr>
-        <w:annotationRef/>
-      </w:r>
-      <w:r>
-        <w:t>Corregido — David Acha</w:t>
-      </w:r>
-    </w:p>
-  </w:comment>
-  <w:comment w:id="16" w:author="David Acha" w:date="2026-08-21T01:25:00Z" w:initials="DA">
+        <w:t>Observación:</w:t>
+      </w:r>
+    </w:p>
     <w:p>
       <w:pPr>
         <w:pStyle w:val="CommentText"/>
         <w:jc w:val="left"/>
       </w:pPr>
       <w:r>
-        <w:rPr>
-          <w:rStyle w:val="CommentReference"/>
-        </w:rPr>
-        <w:annotationRef/>
-      </w:r>
-      <w:r>
-        <w:t>“ORIGINAL”</w:t>
-      </w:r>
-      <w:r>
-        <w:br/>
-        <w:t>Sugerencia: La viabilidad no partirá del supuesto de una prestación permanente de servicios sin costo, sino de la estimación de los recursos necesarios para el prototipo y documentar cómo evolucionarían los costos ante un incremento en el número de usuarios.</w:t>
-      </w:r>
-    </w:p>
-    <w:p>
-      <w:pPr>
-        <w:pStyle w:val="CommentText"/>
-        <w:jc w:val="left"/>
-      </w:pPr>
-      <w:r>
-        <w:t>Observación:</w:t>
-      </w:r>
-    </w:p>
-    <w:p>
-      <w:pPr>
-        <w:pStyle w:val="CommentText"/>
-        <w:jc w:val="left"/>
-      </w:pPr>
-      <w:r>
         <w:t xml:space="preserve">Se requiere precisar el modelo de sostenibilidad económica del sistema respecto al usuario final. El texto describe adecuadamente los costos asociados al desarrollo y operación del prototipo, pero no establece si el acceso al servicio será gratuito para los usuarios, si tendrá alguna modalidad de pago?. En caso de contemplarse acceso gratuito para el usuario, debe explicarse bajo qué condiciones y cómo se sostendrían los costos de operación a medida que aumente el número de usuarios. </w:t>
       </w:r>
     </w:p>
   </w:comment>
-  <w:comment w:id="20" w:author="David Acha" w:date="2026-08-21T05:18:00Z" w:initials="">
-    <w:p>
-      <w:r>
-        <w:rPr>
-          <w:rStyle w:val="CommentReference"/>
-        </w:rPr>
-        <w:annotationRef/>
-      </w:r>
-      <w:r>
-        <w:t>Corregido — David Acha</w:t>
-      </w:r>
-    </w:p>
-  </w:comment>
-  <w:comment w:id="23" w:author="Magaly Gomez Ugarte" w:date="2026-08-15T19:42:00Z" w:initials="MG">
+  <w:comment w:id="14" w:author="Magaly Gomez Ugarte" w:date="2026-08-15T19:42:00Z" w:initials="MG">
     <w:p>
       <w:pPr>
         <w:pStyle w:val="CommentText"/>
@@ -9197,599 +8975,111 @@
       </w:r>
     </w:p>
   </w:comment>
+  <w:comment w:id="13" w:author="David Acha" w:date="2026-08-21T05:18:00Z" w:initials="">
+    <w:p>
+      <w:r>
+        <w:rPr>
+          <w:rStyle w:val="CommentReference"/>
+        </w:rPr>
+        <w:annotationRef/>
+      </w:r>
+      <w:r>
+        <w:t>Corregido — David Acha</w:t>
+      </w:r>
+    </w:p>
+  </w:comment>
+  <w:comment w:id="15" w:author="David Acha" w:date="2026-08-21T05:18:00Z" w:initials="">
+    <w:p>
+      <w:r>
+        <w:rPr>
+          <w:rStyle w:val="CommentReference"/>
+        </w:rPr>
+        <w:annotationRef/>
+      </w:r>
+      <w:r>
+        <w:t>Corregido — David Acha</w:t>
+      </w:r>
+    </w:p>
+  </w:comment>
+  <w:comment w:id="16" w:author="David Acha" w:date="2026-08-21T05:18:00Z" w:initials="">
+    <w:p>
+      <w:r>
+        <w:rPr>
+          <w:rStyle w:val="CommentReference"/>
+        </w:rPr>
+        <w:annotationRef/>
+      </w:r>
+      <w:r>
+        <w:t>Corregido — David Acha</w:t>
+      </w:r>
+    </w:p>
+  </w:comment>
+  <w:comment w:id="17" w:author="David Acha" w:date="2026-08-21T05:18:00Z" w:initials="">
+    <w:p>
+      <w:r>
+        <w:rPr>
+          <w:rStyle w:val="CommentReference"/>
+        </w:rPr>
+        <w:annotationRef/>
+      </w:r>
+      <w:r>
+        <w:t>Corregido — David Acha</w:t>
+      </w:r>
+    </w:p>
+  </w:comment>
+  <w:comment w:id="19" w:author="David Acha" w:date="2026-08-21T05:18:00Z" w:initials="">
+    <w:p>
+      <w:r>
+        <w:rPr>
+          <w:rStyle w:val="CommentReference"/>
+        </w:rPr>
+        <w:annotationRef/>
+      </w:r>
+      <w:r>
+        <w:t>Corregido — David Acha</w:t>
+      </w:r>
+    </w:p>
+  </w:comment>
+  <w:comment w:id="18" w:author="David Acha" w:date="2026-08-21T05:18:00Z" w:initials="">
+    <w:p>
+      <w:r>
+        <w:rPr>
+          <w:rStyle w:val="CommentReference"/>
+        </w:rPr>
+        <w:annotationRef/>
+      </w:r>
+      <w:r>
+        <w:t>Corregido — David Acha</w:t>
+      </w:r>
+    </w:p>
+  </w:comment>
+  <w:comment w:id="21" w:author="David Acha" w:date="2026-08-21T05:18:00Z" w:initials="">
+    <w:p>
+      <w:r>
+        <w:rPr>
+          <w:rStyle w:val="CommentReference"/>
+        </w:rPr>
+        <w:annotationRef/>
+      </w:r>
+      <w:r>
+        <w:t>Corregido — David Acha</w:t>
+      </w:r>
+    </w:p>
+  </w:comment>
+  <w:comment w:id="20" w:author="David Acha" w:date="2026-08-21T05:18:00Z" w:initials="">
+    <w:p>
+      <w:r>
+        <w:rPr>
+          <w:rStyle w:val="CommentReference"/>
+        </w:rPr>
+        <w:annotationRef/>
+      </w:r>
+      <w:r>
+        <w:t>Corregido — David Acha</w:t>
+      </w:r>
+    </w:p>
+  </w:comment>
   <w:comment w:id="22" w:author="David Acha" w:date="2026-08-21T05:18:00Z" w:initials="">
-    <w:p>
-      <w:r>
-        <w:rPr>
-          <w:rStyle w:val="CommentReference"/>
-        </w:rPr>
-        <w:annotationRef/>
-      </w:r>
-      <w:r>
-        <w:t>Corregido — David Acha</w:t>
-      </w:r>
-    </w:p>
-  </w:comment>
-  <w:comment w:id="24" w:author="David Acha" w:date="2026-08-21T05:18:00Z" w:initials="">
-    <w:p>
-      <w:r>
-        <w:rPr>
-          <w:rStyle w:val="CommentReference"/>
-        </w:rPr>
-        <w:annotationRef/>
-      </w:r>
-      <w:r>
-        <w:t>Corregido — David Acha</w:t>
-      </w:r>
-    </w:p>
-  </w:comment>
-  <w:comment w:id="25" w:author="David Acha" w:date="2026-08-21T05:18:00Z" w:initials="">
-    <w:p>
-      <w:r>
-        <w:rPr>
-          <w:rStyle w:val="CommentReference"/>
-        </w:rPr>
-        <w:annotationRef/>
-      </w:r>
-      <w:r>
-        <w:t>Corregido — David Acha</w:t>
-      </w:r>
-    </w:p>
-  </w:comment>
-  <w:comment w:id="26" w:author="David Acha" w:date="2026-08-21T05:18:00Z" w:initials="">
-    <w:p>
-      <w:r>
-        <w:rPr>
-          <w:rStyle w:val="CommentReference"/>
-        </w:rPr>
-        <w:annotationRef/>
-      </w:r>
-      <w:r>
-        <w:t>Corregido — David Acha</w:t>
-      </w:r>
-    </w:p>
-  </w:comment>
-  <w:comment w:id="28" w:author="David Acha" w:date="2026-08-21T05:18:00Z" w:initials="">
-    <w:p>
-      <w:r>
-        <w:rPr>
-          <w:rStyle w:val="CommentReference"/>
-        </w:rPr>
-        <w:annotationRef/>
-      </w:r>
-      <w:r>
-        <w:t>Corregido — David Acha</w:t>
-      </w:r>
-    </w:p>
-  </w:comment>
-  <w:comment w:id="27" w:author="David Acha" w:date="2026-08-21T05:18:00Z" w:initials="">
-    <w:p>
-      <w:r>
-        <w:rPr>
-          <w:rStyle w:val="CommentReference"/>
-        </w:rPr>
-        <w:annotationRef/>
-      </w:r>
-      <w:r>
-        <w:t>Corregido — David Acha</w:t>
-      </w:r>
-    </w:p>
-  </w:comment>
-  <w:comment w:id="29" w:author="David Acha" w:date="2026-08-21T05:18:00Z" w:initials="">
-    <w:p>
-      <w:r>
-        <w:rPr>
-          <w:rStyle w:val="CommentReference"/>
-        </w:rPr>
-        <w:annotationRef/>
-      </w:r>
-      <w:r>
-        <w:t>Corregido — David Acha</w:t>
-      </w:r>
-    </w:p>
-  </w:comment>
-  <w:comment w:id="32" w:author="Magaly Gomez Ugarte" w:date="2026-08-15T20:51:00Z" w:initials="MG">
-    <w:p>
-      <w:pPr>
-        <w:pStyle w:val="CommentText"/>
-        <w:jc w:val="left"/>
-      </w:pPr>
-      <w:r>
-        <w:rPr>
-          <w:rStyle w:val="CommentReference"/>
-        </w:rPr>
-        <w:annotationRef/>
-      </w:r>
-      <w:r>
-        <w:t xml:space="preserve">El alcance presenta una delimitación adecuada de las principales exclusiones, especialmente respecto al diagnóstico y la interoperabilidad institucional. Sin embargo, se recomienda priorizar las funcionalidades esenciales y precisar el alcance de la IA, indicando qué análisis realizará, cómo se validarán sus resultados y qué datos serán enviados al servicio externo. </w:t>
-      </w:r>
-    </w:p>
-    <w:p>
-      <w:pPr>
-        <w:pStyle w:val="CommentText"/>
-        <w:jc w:val="left"/>
-      </w:pPr>
-      <w:r>
-        <w:t xml:space="preserve">Revisar la inclusión de funcionalidades como auditoría, exportación, gestión de consentimientos y compatibilidad con FHIR, justificando su necesidad dentro del alcance del proyecto. </w:t>
-      </w:r>
-    </w:p>
-  </w:comment>
-  <w:comment w:id="31" w:author="David Acha" w:date="2026-08-21T05:18:00Z" w:initials="">
-    <w:p>
-      <w:r>
-        <w:rPr>
-          <w:rStyle w:val="CommentReference"/>
-        </w:rPr>
-        <w:annotationRef/>
-      </w:r>
-      <w:r>
-        <w:t>Corregido — David Acha</w:t>
-      </w:r>
-    </w:p>
-  </w:comment>
-  <w:comment w:id="34" w:author="David Acha" w:date="2026-08-21T05:18:00Z" w:initials="">
-    <w:p>
-      <w:r>
-        <w:rPr>
-          <w:rStyle w:val="CommentReference"/>
-        </w:rPr>
-        <w:annotationRef/>
-      </w:r>
-      <w:r>
-        <w:t>Corregido — David Acha</w:t>
-      </w:r>
-    </w:p>
-  </w:comment>
-  <w:comment w:id="33" w:author="David Acha" w:date="2026-08-21T05:18:00Z" w:initials="">
-    <w:p>
-      <w:r>
-        <w:rPr>
-          <w:rStyle w:val="CommentReference"/>
-        </w:rPr>
-        <w:annotationRef/>
-      </w:r>
-      <w:r>
-        <w:t>Corregido — David Acha</w:t>
-      </w:r>
-    </w:p>
-  </w:comment>
-  <w:comment w:id="36" w:author="David Acha" w:date="2026-08-21T05:18:00Z" w:initials="">
-    <w:p>
-      <w:r>
-        <w:rPr>
-          <w:rStyle w:val="CommentReference"/>
-        </w:rPr>
-        <w:annotationRef/>
-      </w:r>
-      <w:r>
-        <w:t>Corregido — David Acha</w:t>
-      </w:r>
-    </w:p>
-  </w:comment>
-  <w:comment w:id="35" w:author="David Acha" w:date="2026-08-21T05:18:00Z" w:initials="">
-    <w:p>
-      <w:r>
-        <w:rPr>
-          <w:rStyle w:val="CommentReference"/>
-        </w:rPr>
-        <w:annotationRef/>
-      </w:r>
-      <w:r>
-        <w:t>Corregido — David Acha</w:t>
-      </w:r>
-    </w:p>
-  </w:comment>
-  <w:comment w:id="38" w:author="David Acha" w:date="2026-08-21T05:18:00Z" w:initials="">
-    <w:p>
-      <w:r>
-        <w:rPr>
-          <w:rStyle w:val="CommentReference"/>
-        </w:rPr>
-        <w:annotationRef/>
-      </w:r>
-      <w:r>
-        <w:t>Corregido — David Acha</w:t>
-      </w:r>
-    </w:p>
-  </w:comment>
-  <w:comment w:id="73" w:author="Magaly Gomez Ugarte" w:date="2026-08-15T21:43:00Z" w:initials="MG">
-    <w:p>
-      <w:pPr>
-        <w:pStyle w:val="CommentText"/>
-        <w:jc w:val="left"/>
-      </w:pPr>
-      <w:r>
-        <w:rPr>
-          <w:rStyle w:val="CommentReference"/>
-        </w:rPr>
-        <w:annotationRef/>
-      </w:r>
-      <w:r>
-        <w:rPr>
-          <w:color w:val="EE0000"/>
-        </w:rPr>
-        <w:t xml:space="preserve">Observación: </w:t>
-      </w:r>
-      <w:r>
-        <w:t>Precisar la metodología de evaluación del prototipo, particularmente los instrumentos y criterios mediante los cuales se medirán la usabilidad, facilidad de uso, utilidad y confianza del usuario en las funcionalidades de inteligencia artificial. Se debe establecer la correspondencia entre cada instrumento, la variable o aspecto evaluado y el procedimiento de análisis de los resultados.</w:t>
-      </w:r>
-    </w:p>
-    <w:p>
-      <w:pPr>
-        <w:pStyle w:val="CommentText"/>
-        <w:jc w:val="left"/>
-      </w:pPr>
-      <w:r>
-        <w:rPr>
-          <w:color w:val="EE0000"/>
-        </w:rPr>
-        <w:t xml:space="preserve">Sugerencia: </w:t>
-      </w:r>
-      <w:r>
-        <w:t>Diferenciar claramente los instrumentos utilizados para el diagnóstico inicial de aquellos destinados a evaluar el prototipo. Para la evaluación final, considerar una prueba de tareas acompañada de un instrumento de usabilidad validado o, en su defecto, justificar la construcción del cuestionario propio y definir previamente los indicadores y criterios de interpretación de los resultados.</w:t>
-      </w:r>
-    </w:p>
-  </w:comment>
-  <w:comment w:id="72" w:author="David Acha" w:date="2026-08-21T05:18:00Z" w:initials="">
-    <w:p>
-      <w:r>
-        <w:rPr>
-          <w:rStyle w:val="CommentReference"/>
-        </w:rPr>
-        <w:annotationRef/>
-      </w:r>
-      <w:r>
-        <w:t>Corregido — David Acha</w:t>
-      </w:r>
-    </w:p>
-  </w:comment>
-  <w:comment w:id="77" w:author="Magaly Gomez Ugarte" w:date="2026-08-15T21:35:00Z" w:initials="MG">
-    <w:p>
-      <w:pPr>
-        <w:pStyle w:val="CommentText"/>
-        <w:jc w:val="left"/>
-      </w:pPr>
-      <w:r>
-        <w:rPr>
-          <w:rStyle w:val="CommentReference"/>
-        </w:rPr>
-        <w:annotationRef/>
-      </w:r>
-      <w:r>
-        <w:rPr>
-          <w:color w:val="EE0000"/>
-        </w:rPr>
-        <w:t>Observación:</w:t>
-      </w:r>
-    </w:p>
-    <w:p>
-      <w:pPr>
-        <w:pStyle w:val="CommentText"/>
-        <w:jc w:val="left"/>
-      </w:pPr>
-      <w:r>
-        <w:t>La definición de la población y muestra presenta una inconsistencia metodológica, debido a que se utiliza la fórmula de Cochran para determinar 96 participantes, pero posteriormente se plantea un muestreo no probabilístico por conveniencia. Además, no se diferencian claramente los usuarios potenciales de los profesionales de salud como grupos de estudio.</w:t>
-      </w:r>
-    </w:p>
-    <w:p>
-      <w:pPr>
-        <w:pStyle w:val="CommentText"/>
-        <w:jc w:val="left"/>
-      </w:pPr>
-      <w:r>
-        <w:rPr>
-          <w:color w:val="EE0000"/>
-        </w:rPr>
-        <w:t>Sugerencia:</w:t>
-      </w:r>
-    </w:p>
-    <w:p>
-      <w:pPr>
-        <w:pStyle w:val="CommentText"/>
-        <w:jc w:val="left"/>
-      </w:pPr>
-      <w:r>
-        <w:t>Reformular la población y muestra diferenciando ambos grupos y estableciendo para cada uno el tipo y tamaño de muestreo correspondiente, de acuerdo con el carácter exploratorio de la evaluación del prototipo y sin pretender representatividad estadística de la población de Cochabamba.</w:t>
-      </w:r>
-    </w:p>
-    <w:p>
-      <w:pPr>
-        <w:pStyle w:val="CommentText"/>
-        <w:jc w:val="left"/>
-      </w:pPr>
-      <w:r>
-        <w:rPr>
-          <w:b/>
-          <w:bCs/>
-          <w:color w:val="EE0000"/>
-        </w:rPr>
-        <w:t>Te sugiero que reformules de la siguiente manera:</w:t>
-      </w:r>
-    </w:p>
-    <w:p>
-      <w:pPr>
-        <w:pStyle w:val="CommentText"/>
-        <w:jc w:val="left"/>
-      </w:pPr>
-      <w:r>
-        <w:t>POBLACIÓN</w:t>
-      </w:r>
-    </w:p>
-    <w:p>
-      <w:pPr>
-        <w:pStyle w:val="CommentText"/>
-        <w:jc w:val="left"/>
-      </w:pPr>
-      <w:r>
-        <w:t>La población del estudio estará conformada por dos grupos diferenciados:</w:t>
-      </w:r>
-    </w:p>
-    <w:p>
-      <w:pPr>
-        <w:pStyle w:val="CommentText"/>
-        <w:jc w:val="left"/>
-      </w:pPr>
-      <w:r>
-        <w:t>Grupo 1. Usuarios potenciales: personas mayores de 18 años que gestionen información relacionada con su propia salud o con la salud de un familiar o dependiente.</w:t>
-      </w:r>
-    </w:p>
-    <w:p>
-      <w:pPr>
-        <w:pStyle w:val="CommentText"/>
-        <w:jc w:val="left"/>
-      </w:pPr>
-      <w:r>
-        <w:t>Grupo 2. Profesionales de salud: profesionales del área de salud con experiencia en atención sanitaria y/o gestión de información clínica.</w:t>
-      </w:r>
-    </w:p>
-    <w:p>
-      <w:pPr>
-        <w:pStyle w:val="CommentText"/>
-        <w:jc w:val="left"/>
-      </w:pPr>
-      <w:r>
-        <w:t>MUESTRA Y TIPO DE MUESTREO</w:t>
-      </w:r>
-    </w:p>
-    <w:p>
-      <w:pPr>
-        <w:pStyle w:val="CommentText"/>
-        <w:jc w:val="left"/>
-      </w:pPr>
-      <w:r>
-        <w:t>Grupo 1. Usuarios potenciales</w:t>
-      </w:r>
-    </w:p>
-    <w:p>
-      <w:pPr>
-        <w:pStyle w:val="CommentText"/>
-        <w:jc w:val="left"/>
-      </w:pPr>
-      <w:r>
-        <w:t>Se realizará una evaluación exploratoria con un mínimo de 20 participantes, seleccionados mediante muestreo no probabilístico por conveniencia. Este tamaño se establece considerando el carácter exploratorio de la evaluación del prototipo y los objetivos de usabilidad y percepción de utilidad. Los resultados serán analizados de manera descriptiva y no pretenden representar estadísticamente a la población de Cochabamba.</w:t>
-      </w:r>
-    </w:p>
-    <w:p>
-      <w:pPr>
-        <w:pStyle w:val="CommentText"/>
-        <w:jc w:val="left"/>
-      </w:pPr>
-      <w:r>
-        <w:t>Grupo 2. Profesionales de salud</w:t>
-      </w:r>
-    </w:p>
-    <w:p>
-      <w:pPr>
-        <w:pStyle w:val="CommentText"/>
-        <w:jc w:val="left"/>
-      </w:pPr>
-      <w:r>
-        <w:t>Se seleccionarán entre 5 y 8 profesionales de salud mediante muestreo no probabilístico intencional, considerando su experiencia y pertinencia respecto al manejo de información clínica. Su participación tendrá como finalidad obtener una valoración cualitativa de las funcionalidades y del enfoque del sistema desde una perspectiva profesional.</w:t>
-      </w:r>
-    </w:p>
-    <w:p>
-      <w:pPr>
-        <w:pStyle w:val="CommentText"/>
-        <w:jc w:val="left"/>
-      </w:pPr>
-      <w:r>
-        <w:t>CRITERIOS DE INCLUSIÓN</w:t>
-      </w:r>
-    </w:p>
-    <w:p>
-      <w:pPr>
-        <w:pStyle w:val="CommentText"/>
-        <w:jc w:val="left"/>
-      </w:pPr>
-      <w:r>
-        <w:t>Para usuarios potenciales:</w:t>
-      </w:r>
-    </w:p>
-    <w:p>
-      <w:pPr>
-        <w:pStyle w:val="CommentText"/>
-        <w:numPr>
-          <w:ilvl w:val="0"/>
-          <w:numId w:val="8"/>
-        </w:numPr>
-        <w:jc w:val="left"/>
-      </w:pPr>
-      <w:r>
-        <w:t xml:space="preserve">Tener 18 años o más. </w:t>
-      </w:r>
-    </w:p>
-    <w:p>
-      <w:pPr>
-        <w:pStyle w:val="CommentText"/>
-        <w:numPr>
-          <w:ilvl w:val="0"/>
-          <w:numId w:val="8"/>
-        </w:numPr>
-        <w:jc w:val="left"/>
-      </w:pPr>
-      <w:r>
-        <w:t xml:space="preserve">Residir en el departamento de Cochabamba. </w:t>
-      </w:r>
-    </w:p>
-    <w:p>
-      <w:pPr>
-        <w:pStyle w:val="CommentText"/>
-        <w:numPr>
-          <w:ilvl w:val="0"/>
-          <w:numId w:val="8"/>
-        </w:numPr>
-        <w:jc w:val="left"/>
-      </w:pPr>
-      <w:r>
-        <w:t xml:space="preserve">Gestionar información relacionada con su propia salud o con la salud de un familiar o dependiente. </w:t>
-      </w:r>
-    </w:p>
-    <w:p>
-      <w:pPr>
-        <w:pStyle w:val="CommentText"/>
-        <w:numPr>
-          <w:ilvl w:val="0"/>
-          <w:numId w:val="8"/>
-        </w:numPr>
-        <w:jc w:val="left"/>
-      </w:pPr>
-      <w:r>
-        <w:t xml:space="preserve">Tener acceso a un dispositivo con conexión a Internet para participar en la evaluación. </w:t>
-      </w:r>
-    </w:p>
-    <w:p>
-      <w:pPr>
-        <w:pStyle w:val="CommentText"/>
-        <w:numPr>
-          <w:ilvl w:val="0"/>
-          <w:numId w:val="8"/>
-        </w:numPr>
-        <w:jc w:val="left"/>
-      </w:pPr>
-      <w:r>
-        <w:t xml:space="preserve">Aceptar voluntariamente participar en el estudio mediante el consentimiento informado. </w:t>
-      </w:r>
-    </w:p>
-    <w:p>
-      <w:pPr>
-        <w:pStyle w:val="CommentText"/>
-        <w:jc w:val="left"/>
-      </w:pPr>
-      <w:r>
-        <w:t>Para profesionales de salud:</w:t>
-      </w:r>
-    </w:p>
-    <w:p>
-      <w:pPr>
-        <w:pStyle w:val="CommentText"/>
-        <w:numPr>
-          <w:ilvl w:val="0"/>
-          <w:numId w:val="9"/>
-        </w:numPr>
-        <w:jc w:val="left"/>
-      </w:pPr>
-      <w:r>
-        <w:t xml:space="preserve">Tener 18 años o más. </w:t>
-      </w:r>
-    </w:p>
-    <w:p>
-      <w:pPr>
-        <w:pStyle w:val="CommentText"/>
-        <w:numPr>
-          <w:ilvl w:val="0"/>
-          <w:numId w:val="9"/>
-        </w:numPr>
-        <w:jc w:val="left"/>
-      </w:pPr>
-      <w:r>
-        <w:t xml:space="preserve">Ser profesional del área de salud. </w:t>
-      </w:r>
-    </w:p>
-    <w:p>
-      <w:pPr>
-        <w:pStyle w:val="CommentText"/>
-        <w:numPr>
-          <w:ilvl w:val="0"/>
-          <w:numId w:val="9"/>
-        </w:numPr>
-        <w:jc w:val="left"/>
-      </w:pPr>
-      <w:r>
-        <w:t xml:space="preserve">Contar con experiencia en atención sanitaria y/o gestión de información clínica. </w:t>
-      </w:r>
-    </w:p>
-    <w:p>
-      <w:pPr>
-        <w:pStyle w:val="CommentText"/>
-        <w:numPr>
-          <w:ilvl w:val="0"/>
-          <w:numId w:val="9"/>
-        </w:numPr>
-        <w:jc w:val="left"/>
-      </w:pPr>
-      <w:r>
-        <w:t xml:space="preserve">Tener disposición para evaluar el prototipo y proporcionar retroalimentación. </w:t>
-      </w:r>
-    </w:p>
-    <w:p>
-      <w:pPr>
-        <w:pStyle w:val="CommentText"/>
-        <w:numPr>
-          <w:ilvl w:val="0"/>
-          <w:numId w:val="9"/>
-        </w:numPr>
-        <w:jc w:val="left"/>
-      </w:pPr>
-      <w:r>
-        <w:t xml:space="preserve">Aceptar voluntariamente participar en el estudio mediante el consentimiento informado. </w:t>
-      </w:r>
-    </w:p>
-    <w:p>
-      <w:pPr>
-        <w:pStyle w:val="CommentText"/>
-        <w:jc w:val="left"/>
-      </w:pPr>
-      <w:r>
-        <w:t>CRITERIOS DE EXCLUSIÓN</w:t>
-      </w:r>
-    </w:p>
-    <w:p>
-      <w:pPr>
-        <w:pStyle w:val="CommentText"/>
-        <w:jc w:val="left"/>
-      </w:pPr>
-      <w:r>
-        <w:t>Se excluirán los participantes que no cumplan con los criterios de inclusión establecidos o que manifiesten su decisión de retirarse del estudio en cualquier momento.</w:t>
-      </w:r>
-    </w:p>
-  </w:comment>
-  <w:comment w:id="76" w:author="David Acha" w:date="2026-08-21T05:18:00Z" w:initials="">
-    <w:p>
-      <w:r>
-        <w:rPr>
-          <w:rStyle w:val="CommentReference"/>
-        </w:rPr>
-        <w:annotationRef/>
-      </w:r>
-      <w:r>
-        <w:t>Corregido — David Acha</w:t>
-      </w:r>
-    </w:p>
-  </w:comment>
-  <w:comment w:id="78" w:author="David Acha" w:date="2026-08-21T05:18:00Z" w:initials="">
-    <w:p>
-      <w:r>
-        <w:rPr>
-          <w:rStyle w:val="CommentReference"/>
-        </w:rPr>
-        <w:annotationRef/>
-      </w:r>
-      <w:r>
-        <w:t>Corregido — David Acha</w:t>
-      </w:r>
-    </w:p>
-  </w:comment>
-  <w:comment w:id="81" w:author="David Acha" w:date="2026-08-21T05:18:00Z" w:initials="">
     <w:p>
       <w:r>
         <w:rPr>
@@ -9810,13 +9100,10 @@
   <w15:commentEx w15:paraId="0FECD75B" w15:done="0"/>
   <w15:commentEx w15:paraId="014A84A1" w15:done="0"/>
   <w15:commentEx w15:paraId="0E9DD4E7" w15:paraIdParent="014A84A1" w15:done="0"/>
-  <w15:commentEx w15:paraId="3A65B15F" w15:done="0"/>
-  <w15:commentEx w15:paraId="6A525A5B" w15:paraIdParent="3A65B15F" w15:done="0"/>
   <w15:commentEx w15:paraId="195133E5" w15:done="0"/>
   <w15:commentEx w15:paraId="0136F301" w15:paraIdParent="195133E5" w15:done="0"/>
   <w15:commentEx w15:paraId="3281A9D0" w15:done="0"/>
   <w15:commentEx w15:paraId="4924BA0B" w15:paraIdParent="3281A9D0" w15:done="0"/>
-  <w15:commentEx w15:paraId="335C6B27" w15:done="0"/>
   <w15:commentEx w15:paraId="02DB6E7E" w15:done="0"/>
   <w15:commentEx w15:paraId="7B8781CB" w15:done="0"/>
   <w15:commentEx w15:paraId="188B45A7" w15:done="0"/>
@@ -9824,20 +9111,9 @@
   <w15:commentEx w15:paraId="2841E75A" w15:done="0"/>
   <w15:commentEx w15:paraId="03552152" w15:done="0"/>
   <w15:commentEx w15:paraId="73EBEE0C" w15:done="0"/>
-  <w15:commentEx w15:paraId="3D184975" w15:done="0"/>
-  <w15:commentEx w15:paraId="0DF41A7A" w15:done="0"/>
-  <w15:commentEx w15:paraId="67C6EB16" w15:done="0"/>
-  <w15:commentEx w15:paraId="5535A62C" w15:done="0"/>
-  <w15:commentEx w15:paraId="0634D781" w15:done="0"/>
   <w15:commentEx w15:paraId="343C2A75" w15:done="0"/>
   <w15:commentEx w15:paraId="0335A5FF" w15:done="0"/>
   <w15:commentEx w15:paraId="3C2DD2CC" w15:done="0"/>
-  <w15:commentEx w15:paraId="301E30BB" w15:done="0"/>
-  <w15:commentEx w15:paraId="44FCA791" w15:done="0"/>
-  <w15:commentEx w15:paraId="74898288" w15:done="0"/>
-  <w15:commentEx w15:paraId="2BB52CC9" w15:done="0"/>
-  <w15:commentEx w15:paraId="6083DCF4" w15:done="0"/>
-  <w15:commentEx w15:paraId="3DC076D9" w15:done="0"/>
 </w15:commentsEx>
 </file>
 
@@ -9845,15 +9121,10 @@
 <w16cex:commentsExtensible xmlns:wpc="http://schemas.microsoft.com/office/word/2010/wordprocessingCanvas" xmlns:cx="http://schemas.microsoft.com/office/drawing/2014/chartex" xmlns:cx1="http://schemas.microsoft.com/office/drawing/2015/9/8/chartex" xmlns:cx2="http://schemas.microsoft.com/office/drawing/2015/10/21/chartex" xmlns:cx3="http://schemas.microsoft.com/office/drawing/2016/5/9/chartex" xmlns:cx4="http://schemas.microsoft.com/office/drawing/2016/5/10/chartex" xmlns:cx5="http://schemas.microsoft.com/office/drawing/2016/5/11/chartex" xmlns:cx6="http://schemas.microsoft.com/office/drawing/2016/5/12/chartex" xmlns:cx7="http://schemas.microsoft.com/office/drawing/2016/5/13/chartex" xmlns:cx8="http://schemas.microsoft.com/office/drawing/2016/5/14/chartex" xmlns:cr="http://schemas.microsoft.com/office/comments/2020/reactions" xmlns:mc="http://schemas.openxmlformats.org/markup-compatibility/2006" xmlns:aink="http://schemas.microsoft.com/office/drawing/2016/ink" xmlns:am3d="http://schemas.microsoft.com/office/drawing/2017/model3d" xmlns:o="urn:schemas-microsoft-com:office:office" xmlns:oel="http://schemas.microsoft.com/office/2019/extlst" xmlns:r="http://schemas.openxmlformats.org/officeDocument/2006/relationships" xmlns:m="http://schemas.openxmlformats.org/officeDocument/2006/math" xmlns:v="urn:schemas-microsoft-com:vml" xmlns:wp14="http://schemas.microsoft.com/office/word/2010/wordprocessingDrawing" xmlns:wp="http://schemas.openxmlformats.org/drawingml/2006/wordprocessingDrawing" xmlns:w10="urn:schemas-microsoft-com:office:word" xmlns:w="http://schemas.openxmlformats.org/wordprocessingml/2006/main" xmlns:w14="http://schemas.microsoft.com/office/word/2010/wordml" xmlns:w15="http://schemas.microsoft.com/office/word/2012/wordml" xmlns:w16cex="http://schemas.microsoft.com/office/word/2018/wordml/cex" xmlns:w16cid="http://schemas.microsoft.com/office/word/2016/wordml/cid" xmlns:w16="http://schemas.microsoft.com/office/word/2018/wordml" xmlns:w16du="http://schemas.microsoft.com/office/word/2023/wordml/word16du" xmlns:w16sdtdh="http://schemas.microsoft.com/office/word/2020/wordml/sdtdatahash" xmlns:w16sdtfl="http://schemas.microsoft.com/office/word/2024/wordml/sdtformatlock" xmlns:w16se="http://schemas.microsoft.com/office/word/2015/wordml/symex" xmlns:wpg="http://schemas.microsoft.com/office/word/2010/wordprocessingGroup" xmlns:wpi="http://schemas.microsoft.com/office/word/2010/wordprocessingInk" xmlns:wne="http://schemas.microsoft.com/office/word/2006/wordml" xmlns:wps="http://schemas.microsoft.com/office/word/2010/wordprocessingShape" mc:Ignorable="w14 w15 w16se w16cid w16 w16cex w16sdtdh w16sdtfl cr w16du wp14">
   <w16cex:commentExtensible w16cex:durableId="3BB2A69D" w16cex:dateUtc="2026-08-16T01:50:00Z"/>
   <w16cex:commentExtensible w16cex:durableId="24B6C8A6" w16cex:dateUtc="2026-08-21T05:23:00Z"/>
-  <w16cex:commentExtensible w16cex:durableId="120981FB" w16cex:dateUtc="2026-08-15T20:48:00Z"/>
-  <w16cex:commentExtensible w16cex:durableId="06227942" w16cex:dateUtc="2026-08-21T05:00:00Z"/>
   <w16cex:commentExtensible w16cex:durableId="766320A0" w16cex:dateUtc="2026-08-15T21:07:00Z"/>
   <w16cex:commentExtensible w16cex:durableId="0B433205" w16cex:dateUtc="2026-08-21T05:03:00Z"/>
   <w16cex:commentExtensible w16cex:durableId="79788174" w16cex:dateUtc="2026-08-21T05:25:00Z"/>
   <w16cex:commentExtensible w16cex:durableId="63FAA9FD" w16cex:dateUtc="2026-08-15T23:42:00Z"/>
-  <w16cex:commentExtensible w16cex:durableId="517F3696" w16cex:dateUtc="2026-08-16T00:51:00Z"/>
-  <w16cex:commentExtensible w16cex:durableId="4978B9F4" w16cex:dateUtc="2026-08-16T01:43:00Z"/>
-  <w16cex:commentExtensible w16cex:durableId="533C1F98" w16cex:dateUtc="2026-08-16T01:35:00Z"/>
 </w16cex:commentsExtensible>
 </file>
 
@@ -9862,13 +9133,10 @@
   <w16cid:commentId w16cid:paraId="0FECD75B" w16cid:durableId="3BB2A69D"/>
   <w16cid:commentId w16cid:paraId="014A84A1" w16cid:durableId="014A84A1"/>
   <w16cid:commentId w16cid:paraId="0E9DD4E7" w16cid:durableId="24B6C8A6"/>
-  <w16cid:commentId w16cid:paraId="3A65B15F" w16cid:durableId="120981FB"/>
-  <w16cid:commentId w16cid:paraId="6A525A5B" w16cid:durableId="06227942"/>
   <w16cid:commentId w16cid:paraId="195133E5" w16cid:durableId="766320A0"/>
   <w16cid:commentId w16cid:paraId="0136F301" w16cid:durableId="0B433205"/>
   <w16cid:commentId w16cid:paraId="3281A9D0" w16cid:durableId="3281A9D0"/>
   <w16cid:commentId w16cid:paraId="4924BA0B" w16cid:durableId="79788174"/>
-  <w16cid:commentId w16cid:paraId="335C6B27" w16cid:durableId="335C6B27"/>
   <w16cid:commentId w16cid:paraId="02DB6E7E" w16cid:durableId="63FAA9FD"/>
   <w16cid:commentId w16cid:paraId="7B8781CB" w16cid:durableId="7B8781CB"/>
   <w16cid:commentId w16cid:paraId="188B45A7" w16cid:durableId="188B45A7"/>
@@ -9876,20 +9144,9 @@
   <w16cid:commentId w16cid:paraId="2841E75A" w16cid:durableId="2841E75A"/>
   <w16cid:commentId w16cid:paraId="03552152" w16cid:durableId="03552152"/>
   <w16cid:commentId w16cid:paraId="73EBEE0C" w16cid:durableId="73EBEE0C"/>
-  <w16cid:commentId w16cid:paraId="3D184975" w16cid:durableId="3D184975"/>
-  <w16cid:commentId w16cid:paraId="0DF41A7A" w16cid:durableId="517F3696"/>
-  <w16cid:commentId w16cid:paraId="67C6EB16" w16cid:durableId="67C6EB16"/>
-  <w16cid:commentId w16cid:paraId="5535A62C" w16cid:durableId="5535A62C"/>
-  <w16cid:commentId w16cid:paraId="0634D781" w16cid:durableId="0634D781"/>
   <w16cid:commentId w16cid:paraId="343C2A75" w16cid:durableId="343C2A75"/>
   <w16cid:commentId w16cid:paraId="0335A5FF" w16cid:durableId="0335A5FF"/>
   <w16cid:commentId w16cid:paraId="3C2DD2CC" w16cid:durableId="3C2DD2CC"/>
-  <w16cid:commentId w16cid:paraId="301E30BB" w16cid:durableId="4978B9F4"/>
-  <w16cid:commentId w16cid:paraId="44FCA791" w16cid:durableId="44FCA791"/>
-  <w16cid:commentId w16cid:paraId="74898288" w16cid:durableId="533C1F98"/>
-  <w16cid:commentId w16cid:paraId="2BB52CC9" w16cid:durableId="2BB52CC9"/>
-  <w16cid:commentId w16cid:paraId="6083DCF4" w16cid:durableId="6083DCF4"/>
-  <w16cid:commentId w16cid:paraId="3DC076D9" w16cid:durableId="3DC076D9"/>
 </w16cid:commentsIds>
 </file>
 
@@ -22526,7 +21783,7 @@
     <b:Title>Kanban: Successful evolutionary change for your technology business</b:Title>
     <b:Year>2010</b:Year>
     <b:Publisher>Blue Hole Press</b:Publisher>
-    <b:RefOrder>21</b:RefOrder>
+    <b:RefOrder>12</b:RefOrder>
   </b:Source>
   <b:Source>
     <b:Tag>Bowen2009</b:Tag>
@@ -22549,7 +21806,7 @@
     <b:Issue>2</b:Issue>
     <b:Pages>27-40</b:Pages>
     <b:StandardNumber>10.3316/QRJ0902027</b:StandardNumber>
-    <b:RefOrder>25</b:RefOrder>
+    <b:RefOrder>17</b:RefOrder>
   </b:Source>
   <b:Source>
     <b:Tag>Brooke1996</b:Tag>
@@ -22594,7 +21851,7 @@
     </b:Editor>
     <b:Pages>189-194</b:Pages>
     <b:Publisher>Taylor &amp; Francis</b:Publisher>
-    <b:RefOrder>27</b:RefOrder>
+    <b:RefOrder>19</b:RefOrder>
   </b:Source>
   <b:Source>
     <b:Tag>ChaconStraub2014</b:Tag>
@@ -22618,7 +21875,7 @@
     <b:Edition>2</b:Edition>
     <b:Publisher>Apress</b:Publisher>
     <b:URL>https://git-scm.com/book/en/v2</b:URL>
-    <b:RefOrder>12</b:RefOrder>
+    <b:RefOrder>7</b:RefOrder>
   </b:Source>
   <b:Source>
     <b:Tag>DeepSeek2026</b:Tag>
@@ -22629,7 +21886,7 @@
     <b:Title>DeepSeek API Docs</b:Title>
     <b:Year>2026</b:Year>
     <b:URL>https://api-docs.deepseek.com/</b:URL>
-    <b:RefOrder>11</b:RefOrder>
+    <b:RefOrder>21</b:RefOrder>
   </b:Source>
   <b:Source>
     <b:Tag>Figma2026</b:Tag>
@@ -22640,7 +21897,7 @@
     <b:Title>Figma Design documentation</b:Title>
     <b:Year>2026</b:Year>
     <b:URL>https://help.figma.com/hc/en-us/categories/360002042553-Figma-Design</b:URL>
-    <b:RefOrder>14</b:RefOrder>
+    <b:RefOrder>10</b:RefOrder>
   </b:Source>
   <b:Source>
     <b:Tag>Fink2019</b:Tag>
@@ -22659,7 +21916,7 @@
     <b:Year>2019</b:Year>
     <b:Edition>5</b:Edition>
     <b:Publisher>SAGE Publications</b:Publisher>
-    <b:RefOrder>24</b:RefOrder>
+    <b:RefOrder>16</b:RefOrder>
   </b:Source>
   <b:Source>
     <b:Tag>GitHub2026</b:Tag>
@@ -22670,7 +21927,7 @@
     <b:Title>About GitHub and Git</b:Title>
     <b:Year>2026</b:Year>
     <b:URL>https://docs.github.com/en/get-started/start-your-journey/about-github-and-git</b:URL>
-    <b:RefOrder>13</b:RefOrder>
+    <b:RefOrder>8</b:RefOrder>
   </b:Source>
   <b:Source>
     <b:Tag>Hernandez2014</b:Tag>
@@ -22697,7 +21954,7 @@
     <b:Year>2014</b:Year>
     <b:Edition>6</b:Edition>
     <b:Publisher>McGraw-Hill</b:Publisher>
-    <b:RefOrder>22</b:RefOrder>
+    <b:RefOrder>14</b:RefOrder>
   </b:Source>
   <b:Source>
     <b:Tag>HL7FHIR2023</b:Tag>
@@ -22708,7 +21965,7 @@
     <b:Title>FHIR Release 5 (v5.0.0)</b:Title>
     <b:Year>2023</b:Year>
     <b:URL>https://hl7.org/fhir/</b:URL>
-    <b:RefOrder>4</b:RefOrder>
+    <b:RefOrder>3</b:RefOrder>
   </b:Source>
   <b:Source>
     <b:Tag>ISO2018</b:Tag>
@@ -22718,7 +21975,7 @@
     </b:Author>
     <b:Title>ISO 9241-11:2018 Ergonomics of human-system interaction - Part 11: Usability: Definitions and concepts</b:Title>
     <b:Year>2018</b:Year>
-    <b:RefOrder>19</b:RefOrder>
+    <b:RefOrder>13</b:RefOrder>
   </b:Source>
   <b:Source>
     <b:Tag>ISO2019</b:Tag>
@@ -22728,7 +21985,7 @@
     </b:Author>
     <b:Title>ISO 9241-210:2019 Ergonomics of human-system interaction - Part 210: Human-centred design for interactive systems</b:Title>
     <b:Year>2019</b:Year>
-    <b:RefOrder>17</b:RefOrder>
+    <b:RefOrder>9</b:RefOrder>
   </b:Source>
   <b:Source>
     <b:Tag>Lozada2014</b:Tag>
@@ -22749,7 +22006,7 @@
     <b:Volume>3</b:Volume>
     <b:Issue>1</b:Issue>
     <b:Pages>34-39</b:Pages>
-    <b:RefOrder>23</b:RefOrder>
+    <b:RefOrder>15</b:RefOrder>
   </b:Source>
   <b:Source>
     <b:Tag>MicrosoftAspNet2026</b:Tag>
@@ -22760,7 +22017,7 @@
     <b:Title>ASP.NET Core documentation - .NET 10</b:Title>
     <b:Year>2026</b:Year>
     <b:URL>https://learn.microsoft.com/aspnet/core/</b:URL>
-    <b:RefOrder>6</b:RefOrder>
+    <b:RefOrder>22</b:RefOrder>
   </b:Source>
   <b:Source>
     <b:Tag>MicrosoftIdentity2026</b:Tag>
@@ -22771,7 +22028,7 @@
     <b:Title>Introduction to Identity on ASP.NET Core</b:Title>
     <b:Year>2026</b:Year>
     <b:URL>https://learn.microsoft.com/aspnet/core/security/authentication/identity</b:URL>
-    <b:RefOrder>16</b:RefOrder>
+    <b:RefOrder>23</b:RefOrder>
   </b:Source>
   <b:Source>
     <b:Tag>MicrosoftEFCore2026</b:Tag>
@@ -22782,7 +22039,7 @@
     <b:Title>Microsoft SQL Server EF Core Database Provider</b:Title>
     <b:Year>2026</b:Year>
     <b:URL>https://learn.microsoft.com/ef/core/providers/sql-server/</b:URL>
-    <b:RefOrder>9</b:RefOrder>
+    <b:RefOrder>24</b:RefOrder>
   </b:Source>
   <b:Source>
     <b:Tag>MicrosoftSecurity2026</b:Tag>
@@ -22793,7 +22050,7 @@
     <b:Title>Security for SQL Server Database Engine and Azure SQL Database</b:Title>
     <b:Year>2026</b:Year>
     <b:URL>https://learn.microsoft.com/sql/relational-databases/security/</b:URL>
-    <b:RefOrder>10</b:RefOrder>
+    <b:RefOrder>25</b:RefOrder>
   </b:Source>
   <b:Source>
     <b:Tag>Ohno1988</b:Tag>
@@ -22811,7 +22068,7 @@
     <b:Title>Toyota production system: Beyond large-scale production</b:Title>
     <b:Year>1988</b:Year>
     <b:Publisher>Productivity Press</b:Publisher>
-    <b:RefOrder>20</b:RefOrder>
+    <b:RefOrder>11</b:RefOrder>
   </b:Source>
   <b:Source>
     <b:Tag>OWASP2025</b:Tag>
@@ -22822,7 +22079,7 @@
     <b:Title>OWASP Application Security Verification Standard (ASVS) 5.0.0</b:Title>
     <b:Year>2025</b:Year>
     <b:URL>https://owasp.org/www-project-application-security-verification-standard/</b:URL>
-    <b:RefOrder>7</b:RefOrder>
+    <b:RefOrder>26</b:RefOrder>
   </b:Source>
   <b:Source>
     <b:Tag>Ponto2015</b:Tag>
@@ -22844,7 +22101,7 @@
     <b:Issue>2</b:Issue>
     <b:Pages>168-171</b:Pages>
     <b:URL>https://pmc.ncbi.nlm.nih.gov/articles/PMC4601897/</b:URL>
-    <b:RefOrder>26</b:RefOrder>
+    <b:RefOrder>18</b:RefOrder>
   </b:Source>
   <b:Source>
     <b:Tag>Postman2026</b:Tag>
@@ -22855,7 +22112,7 @@
     <b:Title>Postman Docs</b:Title>
     <b:Year>2026</b:Year>
     <b:URL>https://learning.postman.com/docs/</b:URL>
-    <b:RefOrder>15</b:RefOrder>
+    <b:RefOrder>20</b:RefOrder>
   </b:Source>
   <b:Source>
     <b:Tag>Tang2006</b:Tag>
@@ -22909,7 +22166,7 @@
     <b:Title>Web Content Accessibility Guidelines (WCAG) 2.2</b:Title>
     <b:Year>2023</b:Year>
     <b:URL>https://www.w3.org/TR/WCAG22/</b:URL>
-    <b:RefOrder>18</b:RefOrder>
+    <b:RefOrder>27</b:RefOrder>
   </b:Source>
   <b:Source>
     <b:Tag>WHO2021</b:Tag>
@@ -22920,7 +22177,7 @@
     <b:Title>Ethics and governance of artificial intelligence for health: WHO guidance</b:Title>
     <b:Year>2021</b:Year>
     <b:URL>https://www.who.int/publications/i/item/9789240029200</b:URL>
-    <b:RefOrder>3</b:RefOrder>
+    <b:RefOrder>6</b:RefOrder>
   </b:Source>
   <b:Source>
     <b:Tag>WHO2022</b:Tag>
@@ -22931,7 +22188,7 @@
     <b:Title>Ethical considerations and data protection principles for digital personal health records</b:Title>
     <b:Year>2022</b:Year>
     <b:URL>https://smart.who.int/trust/</b:URL>
-    <b:RefOrder>5</b:RefOrder>
+    <b:RefOrder>4</b:RefOrder>
   </b:Source>
   <b:Source>
     <b:Tag>WHO2025Ethics</b:Tag>
@@ -22942,7 +22199,7 @@
     <b:Title>Ethics and governance of artificial intelligence for health: Guidance on large multi-modal models</b:Title>
     <b:Year>2025</b:Year>
     <b:URL>https://www.who.int/publications/i/item/9789240084759</b:URL>
-    <b:RefOrder>8</b:RefOrder>
+    <b:RefOrder>5</b:RefOrder>
   </b:Source>
   <b:Source>
     <b:Tag>WHO2025Global</b:Tag>
@@ -22968,7 +22225,7 @@
 </file>
 
 <file path=customXml/itemProps2.xml><?xml version="1.0" encoding="utf-8"?>
-<ds:datastoreItem xmlns:ds="http://schemas.openxmlformats.org/officeDocument/2006/customXml" ds:itemID="{C3F39355-CA17-4EF2-8CED-B86918A3E09D}">
+<ds:datastoreItem xmlns:ds="http://schemas.openxmlformats.org/officeDocument/2006/customXml" ds:itemID="{122EA30A-8038-4263-899D-E3641DF07F31}">
   <ds:schemaRefs>
     <ds:schemaRef ds:uri="http://schemas.openxmlformats.org/officeDocument/2006/bibliography"/>
   </ds:schemaRefs>

</xml_diff>